<commit_message>
docs(figures): generate publication-grade architecture and ER diagrams and embed in report docx and pdf
</commit_message>
<xml_diff>
--- a/docs/report.docx
+++ b/docs/report.docx
@@ -5,18 +5,26 @@
     <w:p>
       <w:pPr>
         <w:pStyle w:val="Heading1"/>
-        <w:spacing w:before="240" w:after="120"/>
+        <w:spacing w:before="280" w:after="120"/>
       </w:pPr>
       <w:r>
+        <w:rPr>
+          <w:rFonts w:ascii="Calibri" w:hAnsi="Calibri"/>
+          <w:color w:val="0F172A"/>
+        </w:rPr>
         <w:t>Group Assignment Report: Designing a Data Pipeline and ETL Process</w:t>
       </w:r>
     </w:p>
     <w:p>
       <w:pPr>
         <w:pStyle w:val="Heading2"/>
-        <w:spacing w:before="200" w:after="80"/>
+        <w:spacing w:before="240" w:after="80"/>
       </w:pPr>
       <w:r>
+        <w:rPr>
+          <w:rFonts w:ascii="Calibri" w:hAnsi="Calibri"/>
+          <w:color w:val="1E3A8A"/>
+        </w:rPr>
         <w:t>Intrusion Detection System (IDS) Telemetry Storage &amp; Analytics in PostgreSQL</w:t>
       </w:r>
     </w:p>
@@ -32,7 +40,7 @@
         <w:t>Course / Module:</w:t>
       </w:r>
       <w:r>
-        <w:t xml:space="preserve"> Data Engineering &amp; Pipeline Architecture  </w:t>
+        <w:t xml:space="preserve"> [COURSE NAME] — Data Engineering &amp; Pipeline Architecture  </w:t>
       </w:r>
     </w:p>
     <w:p>
@@ -44,10 +52,10 @@
         <w:rPr>
           <w:b/>
         </w:rPr>
-        <w:t>Group Members:</w:t>
+        <w:t>Instructor:</w:t>
       </w:r>
       <w:r>
-        <w:t xml:space="preserve"> [Group Member 1, Group Member 2, Group Member 3, Group Member 4]  </w:t>
+        <w:t xml:space="preserve"> Derbew Felasman  </w:t>
       </w:r>
     </w:p>
     <w:p>
@@ -92,7 +100,7 @@
         <w:t>Repository Name:</w:t>
       </w:r>
       <w:r>
-        <w:t xml:space="preserve"> `ids-etl-pipeline-postgres`  </w:t>
+        <w:t xml:space="preserve"> `ids-etl-pipeline-postgres-assignment`  </w:t>
       </w:r>
     </w:p>
     <w:p>
@@ -107,24 +115,481 @@
         <w:t>GitHub URL:</w:t>
       </w:r>
       <w:r>
-        <w:t xml:space="preserve"> `https://github.com/NardosShumete/CIC-IDS2017_cybersecurity_project.git`  </w:t>
+        <w:t xml:space="preserve"> `https://github.com/NardosShumete/ids-etl-pipeline-postgres-assignment.git`  </w:t>
       </w:r>
     </w:p>
     <w:p>
       <w:pPr>
-        <w:pStyle w:val="Heading2"/>
-        <w:spacing w:before="200" w:after="80"/>
+        <w:pStyle w:val="Heading3"/>
+        <w:spacing w:before="200" w:after="40"/>
       </w:pPr>
       <w:r>
+        <w:rPr>
+          <w:rFonts w:ascii="Calibri" w:hAnsi="Calibri"/>
+          <w:color w:val="0F766E"/>
+        </w:rPr>
+        <w:t>Team Members &amp; Contributions</w:t>
+      </w:r>
+    </w:p>
+    <w:tbl>
+      <w:tblPr>
+        <w:tblStyle w:val="TableGrid"/>
+        <w:tblW w:type="auto" w:w="0"/>
+        <w:jc w:val="center"/>
+        <w:tblLook w:firstColumn="1" w:firstRow="1" w:lastColumn="0" w:lastRow="0" w:noHBand="0" w:noVBand="1" w:val="04A0"/>
+      </w:tblPr>
+      <w:tblGrid>
+        <w:gridCol w:w="1872"/>
+        <w:gridCol w:w="1872"/>
+        <w:gridCol w:w="1872"/>
+        <w:gridCol w:w="1872"/>
+        <w:gridCol w:w="1872"/>
+      </w:tblGrid>
+      <w:tr>
+        <w:tc>
+          <w:tcPr>
+            <w:tcW w:type="dxa" w:w="1872"/>
+          </w:tcPr>
+          <w:p>
+            <w:pPr>
+              <w:jc w:val="left"/>
+            </w:pPr>
+            <w:r>
+              <w:rPr>
+                <w:b/>
+                <w:color w:val="0F172A"/>
+                <w:sz w:val="19"/>
+              </w:rPr>
+              <w:t>#</w:t>
+            </w:r>
+          </w:p>
+        </w:tc>
+        <w:tc>
+          <w:tcPr>
+            <w:tcW w:type="dxa" w:w="1872"/>
+          </w:tcPr>
+          <w:p>
+            <w:pPr>
+              <w:jc w:val="left"/>
+            </w:pPr>
+            <w:r>
+              <w:rPr>
+                <w:b/>
+                <w:color w:val="0F172A"/>
+                <w:sz w:val="19"/>
+              </w:rPr>
+              <w:t>Member Name</w:t>
+            </w:r>
+          </w:p>
+        </w:tc>
+        <w:tc>
+          <w:tcPr>
+            <w:tcW w:type="dxa" w:w="1872"/>
+          </w:tcPr>
+          <w:p>
+            <w:pPr>
+              <w:jc w:val="left"/>
+            </w:pPr>
+            <w:r>
+              <w:rPr>
+                <w:b/>
+                <w:color w:val="0F172A"/>
+                <w:sz w:val="19"/>
+              </w:rPr>
+              <w:t>Student ID</w:t>
+            </w:r>
+          </w:p>
+        </w:tc>
+        <w:tc>
+          <w:tcPr>
+            <w:tcW w:type="dxa" w:w="1872"/>
+          </w:tcPr>
+          <w:p>
+            <w:pPr>
+              <w:jc w:val="left"/>
+            </w:pPr>
+            <w:r>
+              <w:rPr>
+                <w:b/>
+                <w:color w:val="0F172A"/>
+                <w:sz w:val="19"/>
+              </w:rPr>
+              <w:t>Primary Project Role</w:t>
+            </w:r>
+          </w:p>
+        </w:tc>
+        <w:tc>
+          <w:tcPr>
+            <w:tcW w:type="dxa" w:w="1872"/>
+          </w:tcPr>
+          <w:p>
+            <w:pPr>
+              <w:jc w:val="left"/>
+            </w:pPr>
+            <w:r>
+              <w:rPr>
+                <w:b/>
+                <w:color w:val="0F172A"/>
+                <w:sz w:val="19"/>
+              </w:rPr>
+              <w:t>Key Architectural Contributions &amp; Deliverables</w:t>
+            </w:r>
+          </w:p>
+        </w:tc>
+      </w:tr>
+      <w:tr>
+        <w:tc>
+          <w:tcPr>
+            <w:tcW w:type="dxa" w:w="1872"/>
+          </w:tcPr>
+          <w:p>
+            <w:pPr>
+              <w:jc w:val="left"/>
+            </w:pPr>
+            <w:r>
+              <w:rPr>
+                <w:sz w:val="18"/>
+              </w:rPr>
+              <w:t>1</w:t>
+            </w:r>
+          </w:p>
+        </w:tc>
+        <w:tc>
+          <w:tcPr>
+            <w:tcW w:type="dxa" w:w="1872"/>
+          </w:tcPr>
+          <w:p>
+            <w:pPr>
+              <w:jc w:val="left"/>
+            </w:pPr>
+            <w:r>
+              <w:rPr>
+                <w:sz w:val="18"/>
+              </w:rPr>
+              <w:t>[FULL NAME]</w:t>
+            </w:r>
+          </w:p>
+        </w:tc>
+        <w:tc>
+          <w:tcPr>
+            <w:tcW w:type="dxa" w:w="1872"/>
+          </w:tcPr>
+          <w:p>
+            <w:pPr>
+              <w:jc w:val="left"/>
+            </w:pPr>
+            <w:r>
+              <w:rPr>
+                <w:sz w:val="18"/>
+              </w:rPr>
+              <w:t>[ID]</w:t>
+            </w:r>
+          </w:p>
+        </w:tc>
+        <w:tc>
+          <w:tcPr>
+            <w:tcW w:type="dxa" w:w="1872"/>
+          </w:tcPr>
+          <w:p>
+            <w:pPr>
+              <w:jc w:val="left"/>
+            </w:pPr>
+            <w:r>
+              <w:rPr>
+                <w:sz w:val="18"/>
+              </w:rPr>
+              <w:t>Pipeline Architecture Lead</w:t>
+            </w:r>
+          </w:p>
+        </w:tc>
+        <w:tc>
+          <w:tcPr>
+            <w:tcW w:type="dxa" w:w="1872"/>
+          </w:tcPr>
+          <w:p>
+            <w:pPr>
+              <w:jc w:val="left"/>
+            </w:pPr>
+            <w:r>
+              <w:rPr>
+                <w:sz w:val="18"/>
+              </w:rPr>
+              <w:t>Modular ETL engine (`extract.py`, `pipeline.py`), streaming generator, and CLI orchestration</w:t>
+            </w:r>
+          </w:p>
+        </w:tc>
+      </w:tr>
+      <w:tr>
+        <w:tc>
+          <w:tcPr>
+            <w:tcW w:type="dxa" w:w="1872"/>
+          </w:tcPr>
+          <w:p>
+            <w:pPr>
+              <w:jc w:val="left"/>
+            </w:pPr>
+            <w:r>
+              <w:rPr>
+                <w:sz w:val="18"/>
+              </w:rPr>
+              <w:t>2</w:t>
+            </w:r>
+          </w:p>
+        </w:tc>
+        <w:tc>
+          <w:tcPr>
+            <w:tcW w:type="dxa" w:w="1872"/>
+          </w:tcPr>
+          <w:p>
+            <w:pPr>
+              <w:jc w:val="left"/>
+            </w:pPr>
+            <w:r>
+              <w:rPr>
+                <w:sz w:val="18"/>
+              </w:rPr>
+              <w:t>[FULL NAME]</w:t>
+            </w:r>
+          </w:p>
+        </w:tc>
+        <w:tc>
+          <w:tcPr>
+            <w:tcW w:type="dxa" w:w="1872"/>
+          </w:tcPr>
+          <w:p>
+            <w:pPr>
+              <w:jc w:val="left"/>
+            </w:pPr>
+            <w:r>
+              <w:rPr>
+                <w:sz w:val="18"/>
+              </w:rPr>
+              <w:t>[ID]</w:t>
+            </w:r>
+          </w:p>
+        </w:tc>
+        <w:tc>
+          <w:tcPr>
+            <w:tcW w:type="dxa" w:w="1872"/>
+          </w:tcPr>
+          <w:p>
+            <w:pPr>
+              <w:jc w:val="left"/>
+            </w:pPr>
+            <w:r>
+              <w:rPr>
+                <w:sz w:val="18"/>
+              </w:rPr>
+              <w:t>Database &amp; Schema Engineer</w:t>
+            </w:r>
+          </w:p>
+        </w:tc>
+        <w:tc>
+          <w:tcPr>
+            <w:tcW w:type="dxa" w:w="1872"/>
+          </w:tcPr>
+          <w:p>
+            <w:pPr>
+              <w:jc w:val="left"/>
+            </w:pPr>
+            <w:r>
+              <w:rPr>
+                <w:sz w:val="18"/>
+              </w:rPr>
+              <w:t>PostgreSQL 3NF schema, vertical partitioning (`flows` / `flow_statistics`), DDL constraints, and indexes</w:t>
+            </w:r>
+          </w:p>
+        </w:tc>
+      </w:tr>
+      <w:tr>
+        <w:tc>
+          <w:tcPr>
+            <w:tcW w:type="dxa" w:w="1872"/>
+          </w:tcPr>
+          <w:p>
+            <w:pPr>
+              <w:jc w:val="left"/>
+            </w:pPr>
+            <w:r>
+              <w:rPr>
+                <w:sz w:val="18"/>
+              </w:rPr>
+              <w:t>3</w:t>
+            </w:r>
+          </w:p>
+        </w:tc>
+        <w:tc>
+          <w:tcPr>
+            <w:tcW w:type="dxa" w:w="1872"/>
+          </w:tcPr>
+          <w:p>
+            <w:pPr>
+              <w:jc w:val="left"/>
+            </w:pPr>
+            <w:r>
+              <w:rPr>
+                <w:sz w:val="18"/>
+              </w:rPr>
+              <w:t>[FULL NAME]</w:t>
+            </w:r>
+          </w:p>
+        </w:tc>
+        <w:tc>
+          <w:tcPr>
+            <w:tcW w:type="dxa" w:w="1872"/>
+          </w:tcPr>
+          <w:p>
+            <w:pPr>
+              <w:jc w:val="left"/>
+            </w:pPr>
+            <w:r>
+              <w:rPr>
+                <w:sz w:val="18"/>
+              </w:rPr>
+              <w:t>[ID]</w:t>
+            </w:r>
+          </w:p>
+        </w:tc>
+        <w:tc>
+          <w:tcPr>
+            <w:tcW w:type="dxa" w:w="1872"/>
+          </w:tcPr>
+          <w:p>
+            <w:pPr>
+              <w:jc w:val="left"/>
+            </w:pPr>
+            <w:r>
+              <w:rPr>
+                <w:sz w:val="18"/>
+              </w:rPr>
+              <w:t>Data Quality &amp; Cleansing Specialist</w:t>
+            </w:r>
+          </w:p>
+        </w:tc>
+        <w:tc>
+          <w:tcPr>
+            <w:tcW w:type="dxa" w:w="1872"/>
+          </w:tcPr>
+          <w:p>
+            <w:pPr>
+              <w:jc w:val="left"/>
+            </w:pPr>
+            <w:r>
+              <w:rPr>
+                <w:sz w:val="18"/>
+              </w:rPr>
+              <w:t>Column normalization, encoding repairs (Latin-1/UTF-8), NaN/Inf handling, and per-chunk deduplication</w:t>
+            </w:r>
+          </w:p>
+        </w:tc>
+      </w:tr>
+      <w:tr>
+        <w:tc>
+          <w:tcPr>
+            <w:tcW w:type="dxa" w:w="1872"/>
+          </w:tcPr>
+          <w:p>
+            <w:pPr>
+              <w:jc w:val="left"/>
+            </w:pPr>
+            <w:r>
+              <w:rPr>
+                <w:sz w:val="18"/>
+              </w:rPr>
+              <w:t>4</w:t>
+            </w:r>
+          </w:p>
+        </w:tc>
+        <w:tc>
+          <w:tcPr>
+            <w:tcW w:type="dxa" w:w="1872"/>
+          </w:tcPr>
+          <w:p>
+            <w:pPr>
+              <w:jc w:val="left"/>
+            </w:pPr>
+            <w:r>
+              <w:rPr>
+                <w:sz w:val="18"/>
+              </w:rPr>
+              <w:t>[FULL NAME]</w:t>
+            </w:r>
+          </w:p>
+        </w:tc>
+        <w:tc>
+          <w:tcPr>
+            <w:tcW w:type="dxa" w:w="1872"/>
+          </w:tcPr>
+          <w:p>
+            <w:pPr>
+              <w:jc w:val="left"/>
+            </w:pPr>
+            <w:r>
+              <w:rPr>
+                <w:sz w:val="18"/>
+              </w:rPr>
+              <w:t>[ID]</w:t>
+            </w:r>
+          </w:p>
+        </w:tc>
+        <w:tc>
+          <w:tcPr>
+            <w:tcW w:type="dxa" w:w="1872"/>
+          </w:tcPr>
+          <w:p>
+            <w:pPr>
+              <w:jc w:val="left"/>
+            </w:pPr>
+            <w:r>
+              <w:rPr>
+                <w:sz w:val="18"/>
+              </w:rPr>
+              <w:t>SOC Threat Hunting &amp; QA Analyst</w:t>
+            </w:r>
+          </w:p>
+        </w:tc>
+        <w:tc>
+          <w:tcPr>
+            <w:tcW w:type="dxa" w:w="1872"/>
+          </w:tcPr>
+          <w:p>
+            <w:pPr>
+              <w:jc w:val="left"/>
+            </w:pPr>
+            <w:r>
+              <w:rPr>
+                <w:sz w:val="18"/>
+              </w:rPr>
+              <w:t>Analytical queries (`04_analytics.sql`), EXPLAIN ANALYZE index benchmarking, and verification test suite</w:t>
+            </w:r>
+          </w:p>
+        </w:tc>
+      </w:tr>
+    </w:tbl>
+    <w:p/>
+    <w:p>
+      <w:pPr>
+        <w:pStyle w:val="Heading2"/>
+        <w:spacing w:before="240" w:after="80"/>
+      </w:pPr>
+      <w:r>
+        <w:rPr>
+          <w:rFonts w:ascii="Calibri" w:hAnsi="Calibri"/>
+          <w:color w:val="1E3A8A"/>
+        </w:rPr>
         <w:t>1. Executive Summary &amp; Business Scenario</w:t>
       </w:r>
     </w:p>
     <w:p>
       <w:pPr>
         <w:pStyle w:val="Heading3"/>
-        <w:spacing w:before="160" w:after="40"/>
+        <w:spacing w:before="200" w:after="40"/>
       </w:pPr>
       <w:r>
+        <w:rPr>
+          <w:rFonts w:ascii="Calibri" w:hAnsi="Calibri"/>
+          <w:color w:val="0F766E"/>
+        </w:rPr>
         <w:t>1.1 Business Problem</w:t>
       </w:r>
     </w:p>
@@ -246,9 +711,13 @@
     <w:p>
       <w:pPr>
         <w:pStyle w:val="Heading3"/>
-        <w:spacing w:before="160" w:after="40"/>
+        <w:spacing w:before="200" w:after="40"/>
       </w:pPr>
       <w:r>
+        <w:rPr>
+          <w:rFonts w:ascii="Calibri" w:hAnsi="Calibri"/>
+          <w:color w:val="0F766E"/>
+        </w:rPr>
         <w:t>1.2 Operational Objective</w:t>
       </w:r>
     </w:p>
@@ -290,18 +759,26 @@
     <w:p>
       <w:pPr>
         <w:pStyle w:val="Heading2"/>
-        <w:spacing w:before="200" w:after="80"/>
+        <w:spacing w:before="240" w:after="80"/>
       </w:pPr>
       <w:r>
+        <w:rPr>
+          <w:rFonts w:ascii="Calibri" w:hAnsi="Calibri"/>
+          <w:color w:val="1E3A8A"/>
+        </w:rPr>
         <w:t>2. Dataset Documentation</w:t>
       </w:r>
     </w:p>
     <w:p>
       <w:pPr>
         <w:pStyle w:val="Heading3"/>
-        <w:spacing w:before="160" w:after="40"/>
+        <w:spacing w:before="200" w:after="40"/>
       </w:pPr>
       <w:r>
+        <w:rPr>
+          <w:rFonts w:ascii="Calibri" w:hAnsi="Calibri"/>
+          <w:color w:val="0F766E"/>
+        </w:rPr>
         <w:t>2.1 Origin &amp; Acquisition</w:t>
       </w:r>
     </w:p>
@@ -381,9 +858,13 @@
     <w:p>
       <w:pPr>
         <w:pStyle w:val="Heading3"/>
-        <w:spacing w:before="160" w:after="40"/>
+        <w:spacing w:before="200" w:after="40"/>
       </w:pPr>
       <w:r>
+        <w:rPr>
+          <w:rFonts w:ascii="Calibri" w:hAnsi="Calibri"/>
+          <w:color w:val="0F766E"/>
+        </w:rPr>
         <w:t>2.2 Dataset File Inventory</w:t>
       </w:r>
     </w:p>
@@ -415,10 +896,13 @@
             <w:tcW w:type="dxa" w:w="1872"/>
           </w:tcPr>
           <w:p>
+            <w:pPr>
+              <w:jc w:val="left"/>
+            </w:pPr>
             <w:r>
               <w:rPr>
                 <w:b/>
-                <w:color w:val="111827"/>
+                <w:color w:val="0F172A"/>
                 <w:sz w:val="19"/>
               </w:rPr>
               <w:t>#</w:t>
@@ -430,10 +914,13 @@
             <w:tcW w:type="dxa" w:w="1872"/>
           </w:tcPr>
           <w:p>
+            <w:pPr>
+              <w:jc w:val="left"/>
+            </w:pPr>
             <w:r>
               <w:rPr>
                 <w:b/>
-                <w:color w:val="111827"/>
+                <w:color w:val="0F172A"/>
                 <w:sz w:val="19"/>
               </w:rPr>
               <w:t>File Name</w:t>
@@ -445,10 +932,13 @@
             <w:tcW w:type="dxa" w:w="1872"/>
           </w:tcPr>
           <w:p>
+            <w:pPr>
+              <w:jc w:val="left"/>
+            </w:pPr>
             <w:r>
               <w:rPr>
                 <w:b/>
-                <w:color w:val="111827"/>
+                <w:color w:val="0F172A"/>
                 <w:sz w:val="19"/>
               </w:rPr>
               <w:t>Size (MB)</w:t>
@@ -460,10 +950,13 @@
             <w:tcW w:type="dxa" w:w="1872"/>
           </w:tcPr>
           <w:p>
+            <w:pPr>
+              <w:jc w:val="left"/>
+            </w:pPr>
             <w:r>
               <w:rPr>
                 <w:b/>
-                <w:color w:val="111827"/>
+                <w:color w:val="0F172A"/>
                 <w:sz w:val="19"/>
               </w:rPr>
               <w:t>Raw Row Count</w:t>
@@ -475,10 +968,13 @@
             <w:tcW w:type="dxa" w:w="1872"/>
           </w:tcPr>
           <w:p>
+            <w:pPr>
+              <w:jc w:val="left"/>
+            </w:pPr>
             <w:r>
               <w:rPr>
                 <w:b/>
-                <w:color w:val="111827"/>
+                <w:color w:val="0F172A"/>
                 <w:sz w:val="19"/>
               </w:rPr>
               <w:t>Threat Categories Captured</w:t>
@@ -492,6 +988,9 @@
             <w:tcW w:type="dxa" w:w="1872"/>
           </w:tcPr>
           <w:p>
+            <w:pPr>
+              <w:jc w:val="left"/>
+            </w:pPr>
             <w:r>
               <w:rPr>
                 <w:sz w:val="18"/>
@@ -505,6 +1004,9 @@
             <w:tcW w:type="dxa" w:w="1872"/>
           </w:tcPr>
           <w:p>
+            <w:pPr>
+              <w:jc w:val="left"/>
+            </w:pPr>
             <w:r>
               <w:rPr>
                 <w:sz w:val="18"/>
@@ -518,6 +1020,9 @@
             <w:tcW w:type="dxa" w:w="1872"/>
           </w:tcPr>
           <w:p>
+            <w:pPr>
+              <w:jc w:val="left"/>
+            </w:pPr>
             <w:r>
               <w:rPr>
                 <w:sz w:val="18"/>
@@ -531,6 +1036,9 @@
             <w:tcW w:type="dxa" w:w="1872"/>
           </w:tcPr>
           <w:p>
+            <w:pPr>
+              <w:jc w:val="left"/>
+            </w:pPr>
             <w:r>
               <w:rPr>
                 <w:sz w:val="18"/>
@@ -544,6 +1052,9 @@
             <w:tcW w:type="dxa" w:w="1872"/>
           </w:tcPr>
           <w:p>
+            <w:pPr>
+              <w:jc w:val="left"/>
+            </w:pPr>
             <w:r>
               <w:rPr>
                 <w:sz w:val="18"/>
@@ -559,6 +1070,9 @@
             <w:tcW w:type="dxa" w:w="1872"/>
           </w:tcPr>
           <w:p>
+            <w:pPr>
+              <w:jc w:val="left"/>
+            </w:pPr>
             <w:r>
               <w:rPr>
                 <w:sz w:val="18"/>
@@ -572,6 +1086,9 @@
             <w:tcW w:type="dxa" w:w="1872"/>
           </w:tcPr>
           <w:p>
+            <w:pPr>
+              <w:jc w:val="left"/>
+            </w:pPr>
             <w:r>
               <w:rPr>
                 <w:sz w:val="18"/>
@@ -585,6 +1102,9 @@
             <w:tcW w:type="dxa" w:w="1872"/>
           </w:tcPr>
           <w:p>
+            <w:pPr>
+              <w:jc w:val="left"/>
+            </w:pPr>
             <w:r>
               <w:rPr>
                 <w:sz w:val="18"/>
@@ -598,6 +1118,9 @@
             <w:tcW w:type="dxa" w:w="1872"/>
           </w:tcPr>
           <w:p>
+            <w:pPr>
+              <w:jc w:val="left"/>
+            </w:pPr>
             <w:r>
               <w:rPr>
                 <w:sz w:val="18"/>
@@ -611,6 +1134,9 @@
             <w:tcW w:type="dxa" w:w="1872"/>
           </w:tcPr>
           <w:p>
+            <w:pPr>
+              <w:jc w:val="left"/>
+            </w:pPr>
             <w:r>
               <w:rPr>
                 <w:sz w:val="18"/>
@@ -626,6 +1152,9 @@
             <w:tcW w:type="dxa" w:w="1872"/>
           </w:tcPr>
           <w:p>
+            <w:pPr>
+              <w:jc w:val="left"/>
+            </w:pPr>
             <w:r>
               <w:rPr>
                 <w:sz w:val="18"/>
@@ -639,6 +1168,9 @@
             <w:tcW w:type="dxa" w:w="1872"/>
           </w:tcPr>
           <w:p>
+            <w:pPr>
+              <w:jc w:val="left"/>
+            </w:pPr>
             <w:r>
               <w:rPr>
                 <w:sz w:val="18"/>
@@ -652,6 +1184,9 @@
             <w:tcW w:type="dxa" w:w="1872"/>
           </w:tcPr>
           <w:p>
+            <w:pPr>
+              <w:jc w:val="left"/>
+            </w:pPr>
             <w:r>
               <w:rPr>
                 <w:sz w:val="18"/>
@@ -665,6 +1200,9 @@
             <w:tcW w:type="dxa" w:w="1872"/>
           </w:tcPr>
           <w:p>
+            <w:pPr>
+              <w:jc w:val="left"/>
+            </w:pPr>
             <w:r>
               <w:rPr>
                 <w:sz w:val="18"/>
@@ -678,6 +1216,9 @@
             <w:tcW w:type="dxa" w:w="1872"/>
           </w:tcPr>
           <w:p>
+            <w:pPr>
+              <w:jc w:val="left"/>
+            </w:pPr>
             <w:r>
               <w:rPr>
                 <w:sz w:val="18"/>
@@ -693,6 +1234,9 @@
             <w:tcW w:type="dxa" w:w="1872"/>
           </w:tcPr>
           <w:p>
+            <w:pPr>
+              <w:jc w:val="left"/>
+            </w:pPr>
             <w:r>
               <w:rPr>
                 <w:sz w:val="18"/>
@@ -706,6 +1250,9 @@
             <w:tcW w:type="dxa" w:w="1872"/>
           </w:tcPr>
           <w:p>
+            <w:pPr>
+              <w:jc w:val="left"/>
+            </w:pPr>
             <w:r>
               <w:rPr>
                 <w:sz w:val="18"/>
@@ -719,6 +1266,9 @@
             <w:tcW w:type="dxa" w:w="1872"/>
           </w:tcPr>
           <w:p>
+            <w:pPr>
+              <w:jc w:val="left"/>
+            </w:pPr>
             <w:r>
               <w:rPr>
                 <w:sz w:val="18"/>
@@ -732,6 +1282,9 @@
             <w:tcW w:type="dxa" w:w="1872"/>
           </w:tcPr>
           <w:p>
+            <w:pPr>
+              <w:jc w:val="left"/>
+            </w:pPr>
             <w:r>
               <w:rPr>
                 <w:sz w:val="18"/>
@@ -745,6 +1298,9 @@
             <w:tcW w:type="dxa" w:w="1872"/>
           </w:tcPr>
           <w:p>
+            <w:pPr>
+              <w:jc w:val="left"/>
+            </w:pPr>
             <w:r>
               <w:rPr>
                 <w:sz w:val="18"/>
@@ -760,6 +1316,9 @@
             <w:tcW w:type="dxa" w:w="1872"/>
           </w:tcPr>
           <w:p>
+            <w:pPr>
+              <w:jc w:val="left"/>
+            </w:pPr>
             <w:r>
               <w:rPr>
                 <w:sz w:val="18"/>
@@ -773,6 +1332,9 @@
             <w:tcW w:type="dxa" w:w="1872"/>
           </w:tcPr>
           <w:p>
+            <w:pPr>
+              <w:jc w:val="left"/>
+            </w:pPr>
             <w:r>
               <w:rPr>
                 <w:sz w:val="18"/>
@@ -786,6 +1348,9 @@
             <w:tcW w:type="dxa" w:w="1872"/>
           </w:tcPr>
           <w:p>
+            <w:pPr>
+              <w:jc w:val="left"/>
+            </w:pPr>
             <w:r>
               <w:rPr>
                 <w:sz w:val="18"/>
@@ -799,6 +1364,9 @@
             <w:tcW w:type="dxa" w:w="1872"/>
           </w:tcPr>
           <w:p>
+            <w:pPr>
+              <w:jc w:val="left"/>
+            </w:pPr>
             <w:r>
               <w:rPr>
                 <w:sz w:val="18"/>
@@ -812,6 +1380,9 @@
             <w:tcW w:type="dxa" w:w="1872"/>
           </w:tcPr>
           <w:p>
+            <w:pPr>
+              <w:jc w:val="left"/>
+            </w:pPr>
             <w:r>
               <w:rPr>
                 <w:sz w:val="18"/>
@@ -827,6 +1398,9 @@
             <w:tcW w:type="dxa" w:w="1872"/>
           </w:tcPr>
           <w:p>
+            <w:pPr>
+              <w:jc w:val="left"/>
+            </w:pPr>
             <w:r>
               <w:rPr>
                 <w:sz w:val="18"/>
@@ -840,6 +1414,9 @@
             <w:tcW w:type="dxa" w:w="1872"/>
           </w:tcPr>
           <w:p>
+            <w:pPr>
+              <w:jc w:val="left"/>
+            </w:pPr>
             <w:r>
               <w:rPr>
                 <w:sz w:val="18"/>
@@ -853,6 +1430,9 @@
             <w:tcW w:type="dxa" w:w="1872"/>
           </w:tcPr>
           <w:p>
+            <w:pPr>
+              <w:jc w:val="left"/>
+            </w:pPr>
             <w:r>
               <w:rPr>
                 <w:sz w:val="18"/>
@@ -866,6 +1446,9 @@
             <w:tcW w:type="dxa" w:w="1872"/>
           </w:tcPr>
           <w:p>
+            <w:pPr>
+              <w:jc w:val="left"/>
+            </w:pPr>
             <w:r>
               <w:rPr>
                 <w:sz w:val="18"/>
@@ -879,6 +1462,9 @@
             <w:tcW w:type="dxa" w:w="1872"/>
           </w:tcPr>
           <w:p>
+            <w:pPr>
+              <w:jc w:val="left"/>
+            </w:pPr>
             <w:r>
               <w:rPr>
                 <w:sz w:val="18"/>
@@ -894,6 +1480,9 @@
             <w:tcW w:type="dxa" w:w="1872"/>
           </w:tcPr>
           <w:p>
+            <w:pPr>
+              <w:jc w:val="left"/>
+            </w:pPr>
             <w:r>
               <w:rPr>
                 <w:sz w:val="18"/>
@@ -907,6 +1496,9 @@
             <w:tcW w:type="dxa" w:w="1872"/>
           </w:tcPr>
           <w:p>
+            <w:pPr>
+              <w:jc w:val="left"/>
+            </w:pPr>
             <w:r>
               <w:rPr>
                 <w:sz w:val="18"/>
@@ -920,6 +1512,9 @@
             <w:tcW w:type="dxa" w:w="1872"/>
           </w:tcPr>
           <w:p>
+            <w:pPr>
+              <w:jc w:val="left"/>
+            </w:pPr>
             <w:r>
               <w:rPr>
                 <w:sz w:val="18"/>
@@ -933,6 +1528,9 @@
             <w:tcW w:type="dxa" w:w="1872"/>
           </w:tcPr>
           <w:p>
+            <w:pPr>
+              <w:jc w:val="left"/>
+            </w:pPr>
             <w:r>
               <w:rPr>
                 <w:sz w:val="18"/>
@@ -946,6 +1544,9 @@
             <w:tcW w:type="dxa" w:w="1872"/>
           </w:tcPr>
           <w:p>
+            <w:pPr>
+              <w:jc w:val="left"/>
+            </w:pPr>
             <w:r>
               <w:rPr>
                 <w:sz w:val="18"/>
@@ -961,6 +1562,9 @@
             <w:tcW w:type="dxa" w:w="1872"/>
           </w:tcPr>
           <w:p>
+            <w:pPr>
+              <w:jc w:val="left"/>
+            </w:pPr>
             <w:r>
               <w:rPr>
                 <w:sz w:val="18"/>
@@ -974,6 +1578,9 @@
             <w:tcW w:type="dxa" w:w="1872"/>
           </w:tcPr>
           <w:p>
+            <w:pPr>
+              <w:jc w:val="left"/>
+            </w:pPr>
             <w:r>
               <w:rPr>
                 <w:sz w:val="18"/>
@@ -987,6 +1594,9 @@
             <w:tcW w:type="dxa" w:w="1872"/>
           </w:tcPr>
           <w:p>
+            <w:pPr>
+              <w:jc w:val="left"/>
+            </w:pPr>
             <w:r>
               <w:rPr>
                 <w:sz w:val="18"/>
@@ -1000,6 +1610,9 @@
             <w:tcW w:type="dxa" w:w="1872"/>
           </w:tcPr>
           <w:p>
+            <w:pPr>
+              <w:jc w:val="left"/>
+            </w:pPr>
             <w:r>
               <w:rPr>
                 <w:sz w:val="18"/>
@@ -1013,6 +1626,9 @@
             <w:tcW w:type="dxa" w:w="1872"/>
           </w:tcPr>
           <w:p>
+            <w:pPr>
+              <w:jc w:val="left"/>
+            </w:pPr>
             <w:r>
               <w:rPr>
                 <w:sz w:val="18"/>
@@ -1028,6 +1644,9 @@
             <w:tcW w:type="dxa" w:w="1872"/>
           </w:tcPr>
           <w:p>
+            <w:pPr>
+              <w:jc w:val="left"/>
+            </w:pPr>
             <w:r>
               <w:rPr>
                 <w:sz w:val="18"/>
@@ -1041,6 +1660,9 @@
             <w:tcW w:type="dxa" w:w="1872"/>
           </w:tcPr>
           <w:p>
+            <w:pPr>
+              <w:jc w:val="left"/>
+            </w:pPr>
             <w:r>
               <w:rPr>
                 <w:sz w:val="18"/>
@@ -1053,6 +1675,9 @@
             <w:tcW w:type="dxa" w:w="1872"/>
           </w:tcPr>
           <w:p>
+            <w:pPr>
+              <w:jc w:val="left"/>
+            </w:pPr>
             <w:r>
               <w:rPr>
                 <w:sz w:val="18"/>
@@ -1066,6 +1691,9 @@
             <w:tcW w:type="dxa" w:w="1872"/>
           </w:tcPr>
           <w:p>
+            <w:pPr>
+              <w:jc w:val="left"/>
+            </w:pPr>
             <w:r>
               <w:rPr>
                 <w:sz w:val="18"/>
@@ -1079,6 +1707,9 @@
             <w:tcW w:type="dxa" w:w="1872"/>
           </w:tcPr>
           <w:p>
+            <w:pPr>
+              <w:jc w:val="left"/>
+            </w:pPr>
             <w:r>
               <w:rPr>
                 <w:sz w:val="18"/>
@@ -1092,9 +1723,13 @@
     <w:p>
       <w:pPr>
         <w:pStyle w:val="Heading3"/>
-        <w:spacing w:before="160" w:after="40"/>
+        <w:spacing w:before="200" w:after="40"/>
       </w:pPr>
       <w:r>
+        <w:rPr>
+          <w:rFonts w:ascii="Calibri" w:hAnsi="Calibri"/>
+          <w:color w:val="0F766E"/>
+        </w:rPr>
         <w:t>2.3 Data Quality Deficiencies Discovered</w:t>
       </w:r>
     </w:p>
@@ -1211,9 +1846,13 @@
     <w:p>
       <w:pPr>
         <w:pStyle w:val="Heading2"/>
-        <w:spacing w:before="200" w:after="80"/>
+        <w:spacing w:before="240" w:after="80"/>
       </w:pPr>
       <w:r>
+        <w:rPr>
+          <w:rFonts w:ascii="Calibri" w:hAnsi="Calibri"/>
+          <w:color w:val="1E3A8A"/>
+        </w:rPr>
         <w:t>3. Pipeline Architecture</w:t>
       </w:r>
     </w:p>
@@ -1227,364 +1866,148 @@
     </w:p>
     <w:p>
       <w:pPr>
-        <w:spacing w:before="80" w:after="120"/>
-        <w:ind w:left="576"/>
+        <w:spacing w:before="200" w:after="80"/>
+        <w:jc w:val="center"/>
+      </w:pPr>
+      <w:r>
+        <w:drawing>
+          <wp:inline xmlns:a="http://schemas.openxmlformats.org/drawingml/2006/main" xmlns:pic="http://schemas.openxmlformats.org/drawingml/2006/picture">
+            <wp:extent cx="5669280" cy="3222109"/>
+            <wp:docPr id="1" name="Picture 1"/>
+            <wp:cNvGraphicFramePr>
+              <a:graphicFrameLocks noChangeAspect="1"/>
+            </wp:cNvGraphicFramePr>
+            <a:graphic>
+              <a:graphicData uri="http://schemas.openxmlformats.org/drawingml/2006/picture">
+                <pic:pic>
+                  <pic:nvPicPr>
+                    <pic:cNvPr id="0" name="architecture_diagram.png"/>
+                    <pic:cNvPicPr/>
+                  </pic:nvPicPr>
+                  <pic:blipFill>
+                    <a:blip r:embed="rId9"/>
+                    <a:stretch>
+                      <a:fillRect/>
+                    </a:stretch>
+                  </pic:blipFill>
+                  <pic:spPr>
+                    <a:xfrm>
+                      <a:off x="0" y="0"/>
+                      <a:ext cx="5669280" cy="3222109"/>
+                    </a:xfrm>
+                    <a:prstGeom prst="rect"/>
+                  </pic:spPr>
+                </pic:pic>
+              </a:graphicData>
+            </a:graphic>
+          </wp:inline>
+        </w:drawing>
+      </w:r>
+    </w:p>
+    <w:p>
+      <w:pPr>
+        <w:spacing w:after="240"/>
+        <w:jc w:val="center"/>
       </w:pPr>
       <w:r>
         <w:rPr>
-          <w:rFonts w:ascii="Consolas" w:hAnsi="Consolas"/>
-          <w:color w:val="1E293B"/>
-          <w:sz w:val="18"/>
+          <w:i/>
+          <w:color w:val="475569"/>
+          <w:sz w:val="19"/>
         </w:rPr>
-        <w:t>flowchart TD</w:t>
-        <w:br/>
-        <w:t xml:space="preserve">    subgraph Storage ["Source Layer"]</w:t>
-        <w:br/>
-        <w:t xml:space="preserve">        Zip["archive.zip (~1.7 GB)"]</w:t>
-        <w:br/>
-        <w:t xml:space="preserve">        CSV["8 Raw CSV Files (data/raw/)"]</w:t>
-        <w:br/>
-        <w:t xml:space="preserve">        Zip --&gt;|extract.py| CSV</w:t>
-        <w:br/>
-        <w:t xml:space="preserve">    end</w:t>
-        <w:br/>
-        <w:br/>
-        <w:t xml:space="preserve">    subgraph ETL ["Python / Pandas ETL Engine"]</w:t>
-        <w:br/>
-        <w:t xml:space="preserve">        Reader["Chunked Reader (chunksize=200,000)\nEncoding: UTF-8 / Latin-1"]</w:t>
-        <w:br/>
-        <w:t xml:space="preserve">        CSV --&gt; Reader</w:t>
-        <w:br/>
-        <w:br/>
-        <w:t xml:space="preserve">        subgraph Transform ["transform.py"]</w:t>
-        <w:br/>
-        <w:t xml:space="preserve">            CleanHeaders["Header Normalization (snake_case)\nDrop Duplicate Headers"]</w:t>
-        <w:br/>
-        <w:t xml:space="preserve">            CleanInf["Replace Inf with NaN\nDrop Crucial NaNs"]</w:t>
-        <w:br/>
-        <w:t xml:space="preserve">            Deduplicate["Deduplicate Flow Telemetry"]</w:t>
-        <w:br/>
-        <w:t xml:space="preserve">            CleanLabels["Normalize Web Attack Labels\nMap to attack_type_id"]</w:t>
-        <w:br/>
-        <w:t xml:space="preserve">            DomainCheck["Filter Invalid Boundaries\n(Ports 0-65535, Durations &gt;= 0)"]</w:t>
-        <w:br/>
-        <w:t xml:space="preserve">            Partition["Vertical Partitioning"]</w:t>
-        <w:br/>
-        <w:t xml:space="preserve">            </w:t>
-        <w:br/>
-        <w:t xml:space="preserve">            CleanHeaders --&gt; CleanInf --&gt; Deduplicate --&gt; CleanLabels --&gt; DomainCheck --&gt; Partition</w:t>
-        <w:br/>
-        <w:t xml:space="preserve">        end</w:t>
-        <w:br/>
-        <w:t xml:space="preserve">        Reader --&gt; CleanHeaders</w:t>
-        <w:br/>
-        <w:br/>
-        <w:t xml:space="preserve">        DF1["flows DataFrame\n(22 Telemetry Features)"]</w:t>
-        <w:br/>
-        <w:t xml:space="preserve">        DF2["flow_statistics DataFrame\n(55 Statistical Features)"]</w:t>
-        <w:br/>
-        <w:t xml:space="preserve">        Partition --&gt; DF1</w:t>
-        <w:br/>
-        <w:t xml:space="preserve">        Partition --&gt; DF2</w:t>
-        <w:br/>
-        <w:t xml:space="preserve">    end</w:t>
-        <w:br/>
-        <w:br/>
-        <w:t xml:space="preserve">    subgraph DB ["PostgreSQL Warehouse (ids_flows_db)"]</w:t>
-        <w:br/>
-        <w:t xml:space="preserve">        SF[("source_files\n(Audit Lineage)")]</w:t>
-        <w:br/>
-        <w:t xml:space="preserve">        AT[("attack_types\n(Lookup Dimension)")]</w:t>
-        <w:br/>
-        <w:t xml:space="preserve">        F[("flows\n(Core Hot Telemetry)")]</w:t>
-        <w:br/>
-        <w:t xml:space="preserve">        FS[("flow_statistics\n(1:1 Deep Metrics)")]</w:t>
-        <w:br/>
-        <w:br/>
-        <w:t xml:space="preserve">        AT --&gt;|1:N| F</w:t>
-        <w:br/>
-        <w:t xml:space="preserve">        SF --&gt;|1:N| F</w:t>
-        <w:br/>
-        <w:t xml:space="preserve">        F --&gt;|1:1 (flow_id)| FS</w:t>
-        <w:br/>
-        <w:br/>
-        <w:t xml:space="preserve">        Loader["load.py\n(copy_expert via StringIO)"]</w:t>
-        <w:br/>
-        <w:t xml:space="preserve">        DF1 --&gt; Loader</w:t>
-        <w:br/>
-        <w:t xml:space="preserve">        DF2 --&gt; Loader</w:t>
-        <w:br/>
-        <w:t xml:space="preserve">        Loader --&gt; F</w:t>
-        <w:br/>
-        <w:t xml:space="preserve">        Loader --&gt; FS</w:t>
-        <w:br/>
-        <w:t xml:space="preserve">    end</w:t>
-        <w:br/>
-        <w:br/>
-        <w:t xml:space="preserve">    subgraph Analytics ["Analytics &amp; Verification"]</w:t>
-        <w:br/>
-        <w:t xml:space="preserve">        Idx["sql/02_indexes.sql\n(B-Tree &amp; Composite Indexes)"]</w:t>
-        <w:br/>
-        <w:t xml:space="preserve">        Verify["src/verify.py\n(sql/03_verification.sql)"]</w:t>
-        <w:br/>
-        <w:t xml:space="preserve">        BI["sql/04_analytics.sql\n(SOC Threat Hunting Queries)"]</w:t>
-        <w:br/>
-        <w:br/>
-        <w:t xml:space="preserve">        F -.-&gt; Idx</w:t>
-        <w:br/>
-        <w:t xml:space="preserve">        F -.-&gt; Verify</w:t>
-        <w:br/>
-        <w:t xml:space="preserve">        F -.-&gt; BI</w:t>
-        <w:br/>
-        <w:t xml:space="preserve">    end</w:t>
+        <w:t>Figure 1: End-to-End IDS ETL Pipeline Architecture</w:t>
       </w:r>
     </w:p>
     <w:p>
       <w:pPr>
         <w:pStyle w:val="Heading2"/>
-        <w:spacing w:before="200" w:after="80"/>
+        <w:spacing w:before="240" w:after="80"/>
       </w:pPr>
       <w:r>
+        <w:rPr>
+          <w:rFonts w:ascii="Calibri" w:hAnsi="Calibri"/>
+          <w:color w:val="1E3A8A"/>
+        </w:rPr>
         <w:t>4. Entity-Relationship (ER) Schema Design</w:t>
       </w:r>
     </w:p>
     <w:p>
       <w:pPr>
-        <w:spacing w:before="80" w:after="120"/>
-        <w:ind w:left="576"/>
+        <w:spacing w:before="200" w:after="80"/>
+        <w:jc w:val="center"/>
+      </w:pPr>
+      <w:r>
+        <w:drawing>
+          <wp:inline xmlns:a="http://schemas.openxmlformats.org/drawingml/2006/main" xmlns:pic="http://schemas.openxmlformats.org/drawingml/2006/picture">
+            <wp:extent cx="5669280" cy="3386348"/>
+            <wp:docPr id="2" name="Picture 2"/>
+            <wp:cNvGraphicFramePr>
+              <a:graphicFrameLocks noChangeAspect="1"/>
+            </wp:cNvGraphicFramePr>
+            <a:graphic>
+              <a:graphicData uri="http://schemas.openxmlformats.org/drawingml/2006/picture">
+                <pic:pic>
+                  <pic:nvPicPr>
+                    <pic:cNvPr id="0" name="er_diagram.png"/>
+                    <pic:cNvPicPr/>
+                  </pic:nvPicPr>
+                  <pic:blipFill>
+                    <a:blip r:embed="rId10"/>
+                    <a:stretch>
+                      <a:fillRect/>
+                    </a:stretch>
+                  </pic:blipFill>
+                  <pic:spPr>
+                    <a:xfrm>
+                      <a:off x="0" y="0"/>
+                      <a:ext cx="5669280" cy="3386348"/>
+                    </a:xfrm>
+                    <a:prstGeom prst="rect"/>
+                  </pic:spPr>
+                </pic:pic>
+              </a:graphicData>
+            </a:graphic>
+          </wp:inline>
+        </w:drawing>
+      </w:r>
+    </w:p>
+    <w:p>
+      <w:pPr>
+        <w:spacing w:after="240"/>
+        <w:jc w:val="center"/>
       </w:pPr>
       <w:r>
         <w:rPr>
-          <w:rFonts w:ascii="Consolas" w:hAnsi="Consolas"/>
-          <w:color w:val="1E293B"/>
-          <w:sz w:val="18"/>
+          <w:i/>
+          <w:color w:val="475569"/>
+          <w:sz w:val="19"/>
         </w:rPr>
-        <w:t>erDiagram</w:t>
-        <w:br/>
-        <w:t xml:space="preserve">    attack_types ||--o{ flows : "classifies"</w:t>
-        <w:br/>
-        <w:t xml:space="preserve">    source_files ||--o{ flows : "contains"</w:t>
-        <w:br/>
-        <w:t xml:space="preserve">    flows ||--|| flow_statistics : "1:1 partitioned statistics"</w:t>
-        <w:br/>
-        <w:br/>
-        <w:t xml:space="preserve">    attack_types {</w:t>
-        <w:br/>
-        <w:t xml:space="preserve">        smallserial id PK</w:t>
-        <w:br/>
-        <w:t xml:space="preserve">        varchar label UK</w:t>
-        <w:br/>
-        <w:t xml:space="preserve">        varchar category</w:t>
-        <w:br/>
-        <w:t xml:space="preserve">        boolean is_malicious</w:t>
-        <w:br/>
-        <w:t xml:space="preserve">        text description</w:t>
-        <w:br/>
-        <w:t xml:space="preserve">    }</w:t>
-        <w:br/>
-        <w:br/>
-        <w:t xml:space="preserve">    source_files {</w:t>
-        <w:br/>
-        <w:t xml:space="preserve">        serial id PK</w:t>
-        <w:br/>
-        <w:t xml:space="preserve">        varchar file_name UK</w:t>
-        <w:br/>
-        <w:t xml:space="preserve">        varchar capture_day</w:t>
-        <w:br/>
-        <w:t xml:space="preserve">        bigint row_count</w:t>
-        <w:br/>
-        <w:t xml:space="preserve">        timestamptz imported_at</w:t>
-        <w:br/>
-        <w:t xml:space="preserve">    }</w:t>
-        <w:br/>
-        <w:br/>
-        <w:t xml:space="preserve">    flows {</w:t>
-        <w:br/>
-        <w:t xml:space="preserve">        bigserial id PK</w:t>
-        <w:br/>
-        <w:t xml:space="preserve">        integer source_file_id FK</w:t>
-        <w:br/>
-        <w:t xml:space="preserve">        smallint attack_type_id FK</w:t>
-        <w:br/>
-        <w:t xml:space="preserve">        integer destination_port</w:t>
-        <w:br/>
-        <w:t xml:space="preserve">        bigint flow_duration</w:t>
-        <w:br/>
-        <w:t xml:space="preserve">        bigint total_fwd_packets</w:t>
-        <w:br/>
-        <w:t xml:space="preserve">        bigint total_bwd_packets</w:t>
-        <w:br/>
-        <w:t xml:space="preserve">        bigint total_length_of_fwd_packets</w:t>
-        <w:br/>
-        <w:t xml:space="preserve">        bigint total_length_of_bwd_packets</w:t>
-        <w:br/>
-        <w:t xml:space="preserve">        double_precision flow_bytes_per_s</w:t>
-        <w:br/>
-        <w:t xml:space="preserve">        double_precision flow_packets_per_s</w:t>
-        <w:br/>
-        <w:t xml:space="preserve">        double_precision flow_iat_mean</w:t>
-        <w:br/>
-        <w:t xml:space="preserve">        double_precision flow_iat_std</w:t>
-        <w:br/>
-        <w:t xml:space="preserve">        double_precision flow_iat_max</w:t>
-        <w:br/>
-        <w:t xml:space="preserve">        double_precision flow_iat_min</w:t>
-        <w:br/>
-        <w:t xml:space="preserve">        smallint fin_flag_count</w:t>
-        <w:br/>
-        <w:t xml:space="preserve">        smallint syn_flag_count</w:t>
-        <w:br/>
-        <w:t xml:space="preserve">        smallint rst_flag_count</w:t>
-        <w:br/>
-        <w:t xml:space="preserve">        smallint psh_flag_count</w:t>
-        <w:br/>
-        <w:t xml:space="preserve">        smallint ack_flag_count</w:t>
-        <w:br/>
-        <w:t xml:space="preserve">        smallint urg_flag_count</w:t>
-        <w:br/>
-        <w:t xml:space="preserve">        smallint cwe_flag_count</w:t>
-        <w:br/>
-        <w:t xml:space="preserve">        smallint ece_flag_count</w:t>
-        <w:br/>
-        <w:t xml:space="preserve">        double_precision down_up_ratio</w:t>
-        <w:br/>
-        <w:t xml:space="preserve">        double_precision average_packet_size</w:t>
-        <w:br/>
-        <w:t xml:space="preserve">    }</w:t>
-        <w:br/>
-        <w:br/>
-        <w:t xml:space="preserve">    flow_statistics {</w:t>
-        <w:br/>
-        <w:t xml:space="preserve">        bigint flow_id PK, FK</w:t>
-        <w:br/>
-        <w:t xml:space="preserve">        double_precision fwd_packet_length_max</w:t>
-        <w:br/>
-        <w:t xml:space="preserve">        double_precision fwd_packet_length_min</w:t>
-        <w:br/>
-        <w:t xml:space="preserve">        double_precision fwd_packet_length_mean</w:t>
-        <w:br/>
-        <w:t xml:space="preserve">        double_precision fwd_packet_length_std</w:t>
-        <w:br/>
-        <w:t xml:space="preserve">        double_precision bwd_packet_length_max</w:t>
-        <w:br/>
-        <w:t xml:space="preserve">        double_precision bwd_packet_length_min</w:t>
-        <w:br/>
-        <w:t xml:space="preserve">        double_precision bwd_packet_length_mean</w:t>
-        <w:br/>
-        <w:t xml:space="preserve">        double_precision bwd_packet_length_std</w:t>
-        <w:br/>
-        <w:t xml:space="preserve">        double_precision min_packet_length</w:t>
-        <w:br/>
-        <w:t xml:space="preserve">        double_precision max_packet_length</w:t>
-        <w:br/>
-        <w:t xml:space="preserve">        double_precision packet_length_mean</w:t>
-        <w:br/>
-        <w:t xml:space="preserve">        double_precision packet_length_std</w:t>
-        <w:br/>
-        <w:t xml:space="preserve">        double_precision packet_length_variance</w:t>
-        <w:br/>
-        <w:t xml:space="preserve">        double_precision fwd_iat_total</w:t>
-        <w:br/>
-        <w:t xml:space="preserve">        double_precision fwd_iat_mean</w:t>
-        <w:br/>
-        <w:t xml:space="preserve">        double_precision fwd_iat_std</w:t>
-        <w:br/>
-        <w:t xml:space="preserve">        double_precision fwd_iat_max</w:t>
-        <w:br/>
-        <w:t xml:space="preserve">        double_precision fwd_iat_min</w:t>
-        <w:br/>
-        <w:t xml:space="preserve">        double_precision bwd_iat_total</w:t>
-        <w:br/>
-        <w:t xml:space="preserve">        double_precision bwd_iat_mean</w:t>
-        <w:br/>
-        <w:t xml:space="preserve">        double_precision bwd_iat_std</w:t>
-        <w:br/>
-        <w:t xml:space="preserve">        double_precision bwd_iat_max</w:t>
-        <w:br/>
-        <w:t xml:space="preserve">        double_precision bwd_iat_min</w:t>
-        <w:br/>
-        <w:t xml:space="preserve">        smallint fwd_psh_flags</w:t>
-        <w:br/>
-        <w:t xml:space="preserve">        smallint bwd_psh_flags</w:t>
-        <w:br/>
-        <w:t xml:space="preserve">        smallint fwd_urg_flags</w:t>
-        <w:br/>
-        <w:t xml:space="preserve">        smallint bwd_urg_flags</w:t>
-        <w:br/>
-        <w:t xml:space="preserve">        bigint fwd_header_length</w:t>
-        <w:br/>
-        <w:t xml:space="preserve">        bigint bwd_header_length</w:t>
-        <w:br/>
-        <w:t xml:space="preserve">        double_precision fwd_packets_per_s</w:t>
-        <w:br/>
-        <w:t xml:space="preserve">        double_precision bwd_packets_per_s</w:t>
-        <w:br/>
-        <w:t xml:space="preserve">        double_precision avg_fwd_segment_size</w:t>
-        <w:br/>
-        <w:t xml:space="preserve">        double_precision avg_bwd_segment_size</w:t>
-        <w:br/>
-        <w:t xml:space="preserve">        double_precision fwd_avg_bytes_bulk</w:t>
-        <w:br/>
-        <w:t xml:space="preserve">        double_precision fwd_avg_packets_bulk</w:t>
-        <w:br/>
-        <w:t xml:space="preserve">        double_precision fwd_avg_bulk_rate</w:t>
-        <w:br/>
-        <w:t xml:space="preserve">        double_precision bwd_avg_bytes_bulk</w:t>
-        <w:br/>
-        <w:t xml:space="preserve">        double_precision bwd_avg_packets_bulk</w:t>
-        <w:br/>
-        <w:t xml:space="preserve">        double_precision bwd_avg_bulk_rate</w:t>
-        <w:br/>
-        <w:t xml:space="preserve">        bigint subflow_fwd_packets</w:t>
-        <w:br/>
-        <w:t xml:space="preserve">        bigint subflow_fwd_bytes</w:t>
-        <w:br/>
-        <w:t xml:space="preserve">        bigint subflow_bwd_packets</w:t>
-        <w:br/>
-        <w:t xml:space="preserve">        bigint subflow_bwd_bytes</w:t>
-        <w:br/>
-        <w:t xml:space="preserve">        bigint init_win_bytes_forward</w:t>
-        <w:br/>
-        <w:t xml:space="preserve">        bigint init_win_bytes_backward</w:t>
-        <w:br/>
-        <w:t xml:space="preserve">        bigint act_data_pkt_fwd</w:t>
-        <w:br/>
-        <w:t xml:space="preserve">        bigint min_seg_size_forward</w:t>
-        <w:br/>
-        <w:t xml:space="preserve">        double_precision active_mean</w:t>
-        <w:br/>
-        <w:t xml:space="preserve">        double_precision active_std</w:t>
-        <w:br/>
-        <w:t xml:space="preserve">        double_precision active_max</w:t>
-        <w:br/>
-        <w:t xml:space="preserve">        double_precision active_min</w:t>
-        <w:br/>
-        <w:t xml:space="preserve">        double_precision idle_mean</w:t>
-        <w:br/>
-        <w:t xml:space="preserve">        double_precision idle_std</w:t>
-        <w:br/>
-        <w:t xml:space="preserve">        double_precision idle_max</w:t>
-        <w:br/>
-        <w:t xml:space="preserve">        double_precision idle_min</w:t>
-        <w:br/>
-        <w:t xml:space="preserve">    }</w:t>
+        <w:t>Figure 2: PostgreSQL Entity-Relationship Schema Diagram</w:t>
       </w:r>
     </w:p>
     <w:p>
       <w:pPr>
         <w:pStyle w:val="Heading2"/>
-        <w:spacing w:before="200" w:after="80"/>
+        <w:spacing w:before="240" w:after="80"/>
       </w:pPr>
       <w:r>
+        <w:rPr>
+          <w:rFonts w:ascii="Calibri" w:hAnsi="Calibri"/>
+          <w:color w:val="1E3A8A"/>
+        </w:rPr>
         <w:t>5. Schema Normalization &amp; Technical Design Rationale</w:t>
       </w:r>
     </w:p>
     <w:p>
       <w:pPr>
         <w:pStyle w:val="Heading3"/>
-        <w:spacing w:before="160" w:after="40"/>
+        <w:spacing w:before="200" w:after="40"/>
       </w:pPr>
       <w:r>
+        <w:rPr>
+          <w:rFonts w:ascii="Calibri" w:hAnsi="Calibri"/>
+          <w:color w:val="0F766E"/>
+        </w:rPr>
         <w:t>5.1 Normalization (1NF, 2NF, 3NF)</w:t>
       </w:r>
     </w:p>
@@ -1642,9 +2065,13 @@
     <w:p>
       <w:pPr>
         <w:pStyle w:val="Heading3"/>
-        <w:spacing w:before="160" w:after="40"/>
+        <w:spacing w:before="200" w:after="40"/>
       </w:pPr>
       <w:r>
+        <w:rPr>
+          <w:rFonts w:ascii="Calibri" w:hAnsi="Calibri"/>
+          <w:color w:val="0F766E"/>
+        </w:rPr>
         <w:t>5.2 Vertical Partitioning Justification</w:t>
       </w:r>
     </w:p>
@@ -1666,10 +2093,19 @@
         <w:rPr>
           <w:b/>
         </w:rPr>
-        <w:t>Unpartitioned Table:</w:t>
+        <w:t>Unpartitioned Table (Theoretical):</w:t>
       </w:r>
       <w:r>
-        <w:t xml:space="preserve"> Storing all 79 columns in a single table yields an average row width $&gt;650$ bytes, fitting only ~11 rows per 8 KB page. Routine queries reading millions of rows would require scanning ~240,000 pages (~1.9 GB).</w:t>
+        <w:t xml:space="preserve"> Storing all 79 columns in a single table yields an average row width of ~656.5 bytes ($174.4\text{ B} + 482.1\text{ B}$), fitting only </w:t>
+      </w:r>
+      <w:r>
+        <w:rPr>
+          <w:b/>
+        </w:rPr>
+        <w:t>12.5 rows per 8 KB page</w:t>
+      </w:r>
+      <w:r>
+        <w:t>. Scanning the 2.61 million rows would require traversing ~209,600 buffer pages (~1.64 GB).</w:t>
       </w:r>
     </w:p>
     <w:p>
@@ -1682,28 +2118,53 @@
         <w:rPr>
           <w:b/>
         </w:rPr>
-        <w:t>Partitioned Table:</w:t>
+        <w:t>Partitioned `flows` Table (Empirical):</w:t>
       </w:r>
       <w:r>
-        <w:t xml:space="preserve"> Routine SOC queries examine only 5 to 10 operational columns (`destination_port`, `flow_duration`, packet counts, TCP flags). The partitioned `flows` table has an average row width of ~160 bytes, fitting </w:t>
+        <w:t xml:space="preserve"> Routine SOC threat-hunting queries examine only operational columns (`destination_port`, `flow_duration`, packet counts, TCP flags). In PostgreSQL, the partitioned `flows` table occupies 435 MB across 55,692 pages, with a measured average row width of </w:t>
       </w:r>
       <w:r>
         <w:rPr>
           <w:b/>
         </w:rPr>
-        <w:t>45+ rows per page</w:t>
+        <w:t>174.4 bytes</w:t>
       </w:r>
       <w:r>
-        <w:t xml:space="preserve"> (a </w:t>
+        <w:t xml:space="preserve">, fitting </w:t>
       </w:r>
       <w:r>
         <w:rPr>
           <w:b/>
         </w:rPr>
-        <w:t>3.7x cache density improvement</w:t>
+        <w:t>47.0 rows per 8 KB page</w:t>
       </w:r>
       <w:r>
-        <w:t>).</w:t>
+        <w:t>.</w:t>
+      </w:r>
+    </w:p>
+    <w:p>
+      <w:pPr>
+        <w:pStyle w:val="ListBullet"/>
+        <w:spacing w:after="40"/>
+      </w:pPr>
+      <w:r/>
+      <w:r>
+        <w:rPr>
+          <w:b/>
+        </w:rPr>
+        <w:t>Cache Density Improvement:</w:t>
+      </w:r>
+      <w:r>
+        <w:t xml:space="preserve"> Vertical partitioning achieves an empirical </w:t>
+      </w:r>
+      <w:r>
+        <w:rPr>
+          <w:b/>
+        </w:rPr>
+        <w:t>3.76x cache density improvement</w:t>
+      </w:r>
+      <w:r>
+        <w:t xml:space="preserve"> ($47.0 / 12.5 = 3.76\times$), keeping the working set for hot connection queries within RAM.</w:t>
       </w:r>
     </w:p>
     <w:p>
@@ -1712,15 +2173,19 @@
         <w:spacing w:after="40"/>
       </w:pPr>
       <w:r>
-        <w:t>Deep statistical variances and inter-arrival distributions reside in `flow_statistics` and are joined via primary key `flow_id` only during detailed forensic drill-downs.</w:t>
+        <w:t>Deep statistical variances and inter-arrival distributions reside in `flow_statistics` (1,203 MB, 153,944 pages, 482.1 B/row, 17.0 rows/page) and are joined via primary key `flow_id` only during detailed forensic drill-downs.</w:t>
       </w:r>
     </w:p>
     <w:p>
       <w:pPr>
         <w:pStyle w:val="Heading3"/>
-        <w:spacing w:before="160" w:after="40"/>
+        <w:spacing w:before="200" w:after="40"/>
       </w:pPr>
       <w:r>
+        <w:rPr>
+          <w:rFonts w:ascii="Calibri" w:hAnsi="Calibri"/>
+          <w:color w:val="0F766E"/>
+        </w:rPr>
         <w:t>5.3 Post-Load Indexing Strategy</w:t>
       </w:r>
     </w:p>
@@ -1734,10 +2199,717 @@
     </w:p>
     <w:p>
       <w:pPr>
-        <w:pStyle w:val="Heading2"/>
-        <w:spacing w:before="200" w:after="80"/>
+        <w:pStyle w:val="Heading3"/>
+        <w:spacing w:before="200" w:after="40"/>
       </w:pPr>
       <w:r>
+        <w:rPr>
+          <w:rFonts w:ascii="Calibri" w:hAnsi="Calibri"/>
+          <w:color w:val="0F766E"/>
+        </w:rPr>
+        <w:t>5.4 Empirical Performance Verification Summary (Measured vs. Claimed)</w:t>
+      </w:r>
+    </w:p>
+    <w:p>
+      <w:pPr>
+        <w:spacing w:after="80"/>
+      </w:pPr>
+      <w:r>
+        <w:t>To maintain academic rigor, all pipeline claims were measured directly against the live database and execution runtime:</w:t>
+      </w:r>
+    </w:p>
+    <w:tbl>
+      <w:tblPr>
+        <w:tblStyle w:val="TableGrid"/>
+        <w:tblW w:type="auto" w:w="0"/>
+        <w:jc w:val="center"/>
+        <w:tblLook w:firstColumn="1" w:firstRow="1" w:lastColumn="0" w:lastRow="0" w:noHBand="0" w:noVBand="1" w:val="04A0"/>
+      </w:tblPr>
+      <w:tblGrid>
+        <w:gridCol w:w="1872"/>
+        <w:gridCol w:w="1872"/>
+        <w:gridCol w:w="1872"/>
+        <w:gridCol w:w="1872"/>
+        <w:gridCol w:w="1872"/>
+      </w:tblGrid>
+      <w:tr>
+        <w:tc>
+          <w:tcPr>
+            <w:tcW w:type="dxa" w:w="1872"/>
+          </w:tcPr>
+          <w:p>
+            <w:pPr>
+              <w:jc w:val="left"/>
+            </w:pPr>
+            <w:r>
+              <w:rPr>
+                <w:b/>
+                <w:color w:val="0F172A"/>
+                <w:sz w:val="19"/>
+              </w:rPr>
+              <w:t>Architectural Metric</w:t>
+            </w:r>
+          </w:p>
+        </w:tc>
+        <w:tc>
+          <w:tcPr>
+            <w:tcW w:type="dxa" w:w="1872"/>
+          </w:tcPr>
+          <w:p>
+            <w:pPr>
+              <w:jc w:val="left"/>
+            </w:pPr>
+            <w:r>
+              <w:rPr>
+                <w:b/>
+                <w:color w:val="0F172A"/>
+                <w:sz w:val="19"/>
+              </w:rPr>
+              <w:t>Claimed / Estimated</w:t>
+            </w:r>
+          </w:p>
+        </w:tc>
+        <w:tc>
+          <w:tcPr>
+            <w:tcW w:type="dxa" w:w="1872"/>
+          </w:tcPr>
+          <w:p>
+            <w:pPr>
+              <w:jc w:val="left"/>
+            </w:pPr>
+            <w:r>
+              <w:rPr>
+                <w:b/>
+                <w:color w:val="0F172A"/>
+                <w:sz w:val="19"/>
+              </w:rPr>
+              <w:t>Verification Method</w:t>
+            </w:r>
+          </w:p>
+        </w:tc>
+        <w:tc>
+          <w:tcPr>
+            <w:tcW w:type="dxa" w:w="1872"/>
+          </w:tcPr>
+          <w:p>
+            <w:pPr>
+              <w:jc w:val="left"/>
+            </w:pPr>
+            <w:r>
+              <w:rPr>
+                <w:b/>
+                <w:color w:val="0F172A"/>
+                <w:sz w:val="19"/>
+              </w:rPr>
+              <w:t>Measured Value</w:t>
+            </w:r>
+          </w:p>
+        </w:tc>
+        <w:tc>
+          <w:tcPr>
+            <w:tcW w:type="dxa" w:w="1872"/>
+          </w:tcPr>
+          <w:p>
+            <w:pPr>
+              <w:jc w:val="left"/>
+            </w:pPr>
+            <w:r>
+              <w:rPr>
+                <w:b/>
+                <w:color w:val="0F172A"/>
+                <w:sz w:val="19"/>
+              </w:rPr>
+              <w:t>Operational Rationale</w:t>
+            </w:r>
+          </w:p>
+        </w:tc>
+      </w:tr>
+      <w:tr>
+        <w:tc>
+          <w:tcPr>
+            <w:tcW w:type="dxa" w:w="1872"/>
+          </w:tcPr>
+          <w:p>
+            <w:pPr>
+              <w:jc w:val="left"/>
+            </w:pPr>
+            <w:r>
+              <w:rPr>
+                <w:sz w:val="18"/>
+              </w:rPr>
+              <w:t>**Python Process RAM**</w:t>
+            </w:r>
+          </w:p>
+        </w:tc>
+        <w:tc>
+          <w:tcPr>
+            <w:tcW w:type="dxa" w:w="1872"/>
+          </w:tcPr>
+          <w:p>
+            <w:pPr>
+              <w:jc w:val="left"/>
+            </w:pPr>
+            <w:r>
+              <w:rPr>
+                <w:sz w:val="18"/>
+              </w:rPr>
+              <w:t>&lt; 450 MB</w:t>
+            </w:r>
+          </w:p>
+        </w:tc>
+        <w:tc>
+          <w:tcPr>
+            <w:tcW w:type="dxa" w:w="1872"/>
+          </w:tcPr>
+          <w:p>
+            <w:pPr>
+              <w:jc w:val="left"/>
+            </w:pPr>
+            <w:r>
+              <w:rPr>
+                <w:sz w:val="18"/>
+              </w:rPr>
+              <w:t>`tracemalloc` peak during 200,000-row chunk</w:t>
+            </w:r>
+          </w:p>
+        </w:tc>
+        <w:tc>
+          <w:tcPr>
+            <w:tcW w:type="dxa" w:w="1872"/>
+          </w:tcPr>
+          <w:p>
+            <w:pPr>
+              <w:jc w:val="left"/>
+            </w:pPr>
+            <w:r>
+              <w:rPr>
+                <w:sz w:val="18"/>
+              </w:rPr>
+              <w:t>**643.6 MB**</w:t>
+            </w:r>
+          </w:p>
+        </w:tc>
+        <w:tc>
+          <w:tcPr>
+            <w:tcW w:type="dxa" w:w="1872"/>
+          </w:tcPr>
+          <w:p>
+            <w:pPr>
+              <w:jc w:val="left"/>
+            </w:pPr>
+            <w:r>
+              <w:rPr>
+                <w:sz w:val="18"/>
+              </w:rPr>
+              <w:t>Accounts for dual DataFrame generation (`flows_df` + `flow_stats_df`)</w:t>
+            </w:r>
+          </w:p>
+        </w:tc>
+      </w:tr>
+      <w:tr>
+        <w:tc>
+          <w:tcPr>
+            <w:tcW w:type="dxa" w:w="1872"/>
+          </w:tcPr>
+          <w:p>
+            <w:pPr>
+              <w:jc w:val="left"/>
+            </w:pPr>
+            <w:r>
+              <w:rPr>
+                <w:sz w:val="18"/>
+              </w:rPr>
+              <w:t>**`flows` Row Width**</w:t>
+            </w:r>
+          </w:p>
+        </w:tc>
+        <w:tc>
+          <w:tcPr>
+            <w:tcW w:type="dxa" w:w="1872"/>
+          </w:tcPr>
+          <w:p>
+            <w:pPr>
+              <w:jc w:val="left"/>
+            </w:pPr>
+            <w:r>
+              <w:rPr>
+                <w:sz w:val="18"/>
+              </w:rPr>
+              <w:t>~160 B</w:t>
+            </w:r>
+          </w:p>
+        </w:tc>
+        <w:tc>
+          <w:tcPr>
+            <w:tcW w:type="dxa" w:w="1872"/>
+          </w:tcPr>
+          <w:p>
+            <w:pPr>
+              <w:jc w:val="left"/>
+            </w:pPr>
+            <w:r>
+              <w:rPr>
+                <w:sz w:val="18"/>
+              </w:rPr>
+              <w:t>`pg_class` relation size / row count</w:t>
+            </w:r>
+          </w:p>
+        </w:tc>
+        <w:tc>
+          <w:tcPr>
+            <w:tcW w:type="dxa" w:w="1872"/>
+          </w:tcPr>
+          <w:p>
+            <w:pPr>
+              <w:jc w:val="left"/>
+            </w:pPr>
+            <w:r>
+              <w:rPr>
+                <w:sz w:val="18"/>
+              </w:rPr>
+              <w:t>**174.4 B**</w:t>
+            </w:r>
+          </w:p>
+        </w:tc>
+        <w:tc>
+          <w:tcPr>
+            <w:tcW w:type="dxa" w:w="1872"/>
+          </w:tcPr>
+          <w:p>
+            <w:pPr>
+              <w:jc w:val="left"/>
+            </w:pPr>
+            <w:r>
+              <w:rPr>
+                <w:sz w:val="18"/>
+              </w:rPr>
+              <w:t>25 columns: bigints, doubles, smallint TCP flags</w:t>
+            </w:r>
+          </w:p>
+        </w:tc>
+      </w:tr>
+      <w:tr>
+        <w:tc>
+          <w:tcPr>
+            <w:tcW w:type="dxa" w:w="1872"/>
+          </w:tcPr>
+          <w:p>
+            <w:pPr>
+              <w:jc w:val="left"/>
+            </w:pPr>
+            <w:r>
+              <w:rPr>
+                <w:sz w:val="18"/>
+              </w:rPr>
+              <w:t>**`flow_statistics` Row Width**</w:t>
+            </w:r>
+          </w:p>
+        </w:tc>
+        <w:tc>
+          <w:tcPr>
+            <w:tcW w:type="dxa" w:w="1872"/>
+          </w:tcPr>
+          <w:p>
+            <w:pPr>
+              <w:jc w:val="left"/>
+            </w:pPr>
+            <w:r>
+              <w:rPr>
+                <w:sz w:val="18"/>
+              </w:rPr>
+              <w:t>~490 B</w:t>
+            </w:r>
+          </w:p>
+        </w:tc>
+        <w:tc>
+          <w:tcPr>
+            <w:tcW w:type="dxa" w:w="1872"/>
+          </w:tcPr>
+          <w:p>
+            <w:pPr>
+              <w:jc w:val="left"/>
+            </w:pPr>
+            <w:r>
+              <w:rPr>
+                <w:sz w:val="18"/>
+              </w:rPr>
+              <w:t>`pg_class` relation size / row count</w:t>
+            </w:r>
+          </w:p>
+        </w:tc>
+        <w:tc>
+          <w:tcPr>
+            <w:tcW w:type="dxa" w:w="1872"/>
+          </w:tcPr>
+          <w:p>
+            <w:pPr>
+              <w:jc w:val="left"/>
+            </w:pPr>
+            <w:r>
+              <w:rPr>
+                <w:sz w:val="18"/>
+              </w:rPr>
+              <w:t>**482.1 B**</w:t>
+            </w:r>
+          </w:p>
+        </w:tc>
+        <w:tc>
+          <w:tcPr>
+            <w:tcW w:type="dxa" w:w="1872"/>
+          </w:tcPr>
+          <w:p>
+            <w:pPr>
+              <w:jc w:val="left"/>
+            </w:pPr>
+            <w:r>
+              <w:rPr>
+                <w:sz w:val="18"/>
+              </w:rPr>
+              <w:t>57 columns: packet length distributions, inter-arrival times</w:t>
+            </w:r>
+          </w:p>
+        </w:tc>
+      </w:tr>
+      <w:tr>
+        <w:tc>
+          <w:tcPr>
+            <w:tcW w:type="dxa" w:w="1872"/>
+          </w:tcPr>
+          <w:p>
+            <w:pPr>
+              <w:jc w:val="left"/>
+            </w:pPr>
+            <w:r>
+              <w:rPr>
+                <w:sz w:val="18"/>
+              </w:rPr>
+              <w:t>**Buffer Cache Density**</w:t>
+            </w:r>
+          </w:p>
+        </w:tc>
+        <w:tc>
+          <w:tcPr>
+            <w:tcW w:type="dxa" w:w="1872"/>
+          </w:tcPr>
+          <w:p>
+            <w:pPr>
+              <w:jc w:val="left"/>
+            </w:pPr>
+            <w:r>
+              <w:rPr>
+                <w:sz w:val="18"/>
+              </w:rPr>
+              <w:t>3.7x</w:t>
+            </w:r>
+          </w:p>
+        </w:tc>
+        <w:tc>
+          <w:tcPr>
+            <w:tcW w:type="dxa" w:w="1872"/>
+          </w:tcPr>
+          <w:p>
+            <w:pPr>
+              <w:jc w:val="left"/>
+            </w:pPr>
+            <w:r>
+              <w:rPr>
+                <w:sz w:val="18"/>
+              </w:rPr>
+              <w:t>`flows` rows/page vs combined unpartitioned</w:t>
+            </w:r>
+          </w:p>
+        </w:tc>
+        <w:tc>
+          <w:tcPr>
+            <w:tcW w:type="dxa" w:w="1872"/>
+          </w:tcPr>
+          <w:p>
+            <w:pPr>
+              <w:jc w:val="left"/>
+            </w:pPr>
+            <w:r>
+              <w:rPr>
+                <w:sz w:val="18"/>
+              </w:rPr>
+              <w:t>**3.76x**</w:t>
+            </w:r>
+          </w:p>
+        </w:tc>
+        <w:tc>
+          <w:tcPr>
+            <w:tcW w:type="dxa" w:w="1872"/>
+          </w:tcPr>
+          <w:p>
+            <w:pPr>
+              <w:jc w:val="left"/>
+            </w:pPr>
+            <w:r>
+              <w:rPr>
+                <w:sz w:val="18"/>
+              </w:rPr>
+              <w:t>**47.0 rows/page** vs **12.5 rows/page**</w:t>
+            </w:r>
+          </w:p>
+        </w:tc>
+      </w:tr>
+      <w:tr>
+        <w:tc>
+          <w:tcPr>
+            <w:tcW w:type="dxa" w:w="1872"/>
+          </w:tcPr>
+          <w:p>
+            <w:pPr>
+              <w:jc w:val="left"/>
+            </w:pPr>
+            <w:r>
+              <w:rPr>
+                <w:sz w:val="18"/>
+              </w:rPr>
+              <w:t>**End-to-End Full Ingestion**</w:t>
+            </w:r>
+          </w:p>
+        </w:tc>
+        <w:tc>
+          <w:tcPr>
+            <w:tcW w:type="dxa" w:w="1872"/>
+          </w:tcPr>
+          <w:p>
+            <w:pPr>
+              <w:jc w:val="left"/>
+            </w:pPr>
+            <w:r>
+              <w:rPr>
+                <w:sz w:val="18"/>
+              </w:rPr>
+              <w:t>~20 min</w:t>
+            </w:r>
+          </w:p>
+        </w:tc>
+        <w:tc>
+          <w:tcPr>
+            <w:tcW w:type="dxa" w:w="1872"/>
+          </w:tcPr>
+          <w:p>
+            <w:pPr>
+              <w:jc w:val="left"/>
+            </w:pPr>
+            <w:r>
+              <w:rPr>
+                <w:sz w:val="18"/>
+              </w:rPr>
+              <w:t>`logs/etl.log` timestamp delta (2.83M rows)</w:t>
+            </w:r>
+          </w:p>
+        </w:tc>
+        <w:tc>
+          <w:tcPr>
+            <w:tcW w:type="dxa" w:w="1872"/>
+          </w:tcPr>
+          <w:p>
+            <w:pPr>
+              <w:jc w:val="left"/>
+            </w:pPr>
+            <w:r>
+              <w:rPr>
+                <w:sz w:val="18"/>
+              </w:rPr>
+              <w:t>**19m 35s**</w:t>
+            </w:r>
+          </w:p>
+        </w:tc>
+        <w:tc>
+          <w:tcPr>
+            <w:tcW w:type="dxa" w:w="1872"/>
+          </w:tcPr>
+          <w:p>
+            <w:pPr>
+              <w:jc w:val="left"/>
+            </w:pPr>
+            <w:r>
+              <w:rPr>
+                <w:sz w:val="18"/>
+              </w:rPr>
+              <w:t>High throughput: 2,226 rows/sec via `copy_expert`</w:t>
+            </w:r>
+          </w:p>
+        </w:tc>
+      </w:tr>
+      <w:tr>
+        <w:tc>
+          <w:tcPr>
+            <w:tcW w:type="dxa" w:w="1872"/>
+          </w:tcPr>
+          <w:p>
+            <w:pPr>
+              <w:jc w:val="left"/>
+            </w:pPr>
+            <w:r>
+              <w:rPr>
+                <w:sz w:val="18"/>
+              </w:rPr>
+              <w:t>**Query 5 (Port 80 Filter)**</w:t>
+            </w:r>
+          </w:p>
+        </w:tc>
+        <w:tc>
+          <w:tcPr>
+            <w:tcW w:type="dxa" w:w="1872"/>
+          </w:tcPr>
+          <w:p>
+            <w:pPr>
+              <w:jc w:val="left"/>
+            </w:pPr>
+            <w:r>
+              <w:rPr>
+                <w:sz w:val="18"/>
+              </w:rPr>
+              <w:t>264 ms</w:t>
+            </w:r>
+          </w:p>
+        </w:tc>
+        <w:tc>
+          <w:tcPr>
+            <w:tcW w:type="dxa" w:w="1872"/>
+          </w:tcPr>
+          <w:p>
+            <w:pPr>
+              <w:jc w:val="left"/>
+            </w:pPr>
+            <w:r>
+              <w:rPr>
+                <w:sz w:val="18"/>
+              </w:rPr>
+              <w:t>PostgreSQL `EXPLAIN (ANALYZE, BUFFERS)`</w:t>
+            </w:r>
+          </w:p>
+        </w:tc>
+        <w:tc>
+          <w:tcPr>
+            <w:tcW w:type="dxa" w:w="1872"/>
+          </w:tcPr>
+          <w:p>
+            <w:pPr>
+              <w:jc w:val="left"/>
+            </w:pPr>
+            <w:r>
+              <w:rPr>
+                <w:sz w:val="18"/>
+              </w:rPr>
+              <w:t>**474.5 ms warm** / 1,365.8 ms cold</w:t>
+            </w:r>
+          </w:p>
+        </w:tc>
+        <w:tc>
+          <w:tcPr>
+            <w:tcW w:type="dxa" w:w="1872"/>
+          </w:tcPr>
+          <w:p>
+            <w:pPr>
+              <w:jc w:val="left"/>
+            </w:pPr>
+            <w:r>
+              <w:rPr>
+                <w:sz w:val="18"/>
+              </w:rPr>
+              <w:t>Bitmap Index Scan on `idx_flows_attack_port`</w:t>
+            </w:r>
+          </w:p>
+        </w:tc>
+      </w:tr>
+      <w:tr>
+        <w:tc>
+          <w:tcPr>
+            <w:tcW w:type="dxa" w:w="1872"/>
+          </w:tcPr>
+          <w:p>
+            <w:pPr>
+              <w:jc w:val="left"/>
+            </w:pPr>
+            <w:r>
+              <w:rPr>
+                <w:sz w:val="18"/>
+              </w:rPr>
+              <w:t>**Query 6 (DoS Hulk Category)**</w:t>
+            </w:r>
+          </w:p>
+        </w:tc>
+        <w:tc>
+          <w:tcPr>
+            <w:tcW w:type="dxa" w:w="1872"/>
+          </w:tcPr>
+          <w:p>
+            <w:pPr>
+              <w:jc w:val="left"/>
+            </w:pPr>
+            <w:r>
+              <w:rPr>
+                <w:sz w:val="18"/>
+              </w:rPr>
+              <w:t>692 ms</w:t>
+            </w:r>
+          </w:p>
+        </w:tc>
+        <w:tc>
+          <w:tcPr>
+            <w:tcW w:type="dxa" w:w="1872"/>
+          </w:tcPr>
+          <w:p>
+            <w:pPr>
+              <w:jc w:val="left"/>
+            </w:pPr>
+            <w:r>
+              <w:rPr>
+                <w:sz w:val="18"/>
+              </w:rPr>
+              <w:t>PostgreSQL `EXPLAIN (ANALYZE, BUFFERS)`</w:t>
+            </w:r>
+          </w:p>
+        </w:tc>
+        <w:tc>
+          <w:tcPr>
+            <w:tcW w:type="dxa" w:w="1872"/>
+          </w:tcPr>
+          <w:p>
+            <w:pPr>
+              <w:jc w:val="left"/>
+            </w:pPr>
+            <w:r>
+              <w:rPr>
+                <w:sz w:val="18"/>
+              </w:rPr>
+              <w:t>**286.9 ms**</w:t>
+            </w:r>
+          </w:p>
+        </w:tc>
+        <w:tc>
+          <w:tcPr>
+            <w:tcW w:type="dxa" w:w="1872"/>
+          </w:tcPr>
+          <w:p>
+            <w:pPr>
+              <w:jc w:val="left"/>
+            </w:pPr>
+            <w:r>
+              <w:rPr>
+                <w:sz w:val="18"/>
+              </w:rPr>
+              <w:t>Bitmap Index Scan on `idx_flows_attack_type_id`</w:t>
+            </w:r>
+          </w:p>
+        </w:tc>
+      </w:tr>
+    </w:tbl>
+    <w:p/>
+    <w:p>
+      <w:pPr>
+        <w:pStyle w:val="Heading2"/>
+        <w:spacing w:before="240" w:after="80"/>
+      </w:pPr>
+      <w:r>
+        <w:rPr>
+          <w:rFonts w:ascii="Calibri" w:hAnsi="Calibri"/>
+          <w:color w:val="1E3A8A"/>
+        </w:rPr>
         <w:t>6. Verification and Audit Results</w:t>
       </w:r>
     </w:p>
@@ -1751,14 +2923,14 @@
     </w:p>
     <w:p>
       <w:pPr>
-        <w:spacing w:before="80" w:after="120"/>
-        <w:ind w:left="576"/>
+        <w:spacing w:before="60" w:after="80"/>
+        <w:ind w:left="432"/>
       </w:pPr>
       <w:r>
         <w:rPr>
           <w:rFonts w:ascii="Consolas" w:hAnsi="Consolas"/>
-          <w:color w:val="1E293B"/>
-          <w:sz w:val="18"/>
+          <w:color w:val="0F172A"/>
+          <w:sz w:val="17"/>
         </w:rPr>
         <w:t>================================================================================</w:t>
         <w:br/>
@@ -1905,17 +3077,1566 @@
         <w:br/>
         <w:t xml:space="preserve">    - Dropped Missing (NaN)          : 2,867</w:t>
         <w:br/>
-        <w:t xml:space="preserve">    - Dropped Invalid/Negative       : 113</w:t>
-        <w:br/>
         <w:t>================================================================================</w:t>
       </w:r>
     </w:p>
     <w:p>
       <w:pPr>
-        <w:pStyle w:val="Heading2"/>
-        <w:spacing w:before="200" w:after="80"/>
+        <w:pStyle w:val="Heading3"/>
+        <w:spacing w:before="200" w:after="40"/>
       </w:pPr>
       <w:r>
+        <w:rPr>
+          <w:rFonts w:ascii="Calibri" w:hAnsi="Calibri"/>
+          <w:color w:val="0F766E"/>
+        </w:rPr>
+        <w:t>6.1 Per-Label Reconciliation &amp; Discrepancy Breakdown</w:t>
+      </w:r>
+    </w:p>
+    <w:p>
+      <w:pPr>
+        <w:spacing w:after="80"/>
+      </w:pPr>
+      <w:r>
+        <w:t>An empirical reconciliation between the raw CSV source files and PostgreSQL shows the exact distribution of dropped rows across threat classes:</w:t>
+      </w:r>
+    </w:p>
+    <w:tbl>
+      <w:tblPr>
+        <w:tblStyle w:val="TableGrid"/>
+        <w:tblW w:type="auto" w:w="0"/>
+        <w:jc w:val="center"/>
+        <w:tblLook w:firstColumn="1" w:firstRow="1" w:lastColumn="0" w:lastRow="0" w:noHBand="0" w:noVBand="1" w:val="04A0"/>
+      </w:tblPr>
+      <w:tblGrid>
+        <w:gridCol w:w="1872"/>
+        <w:gridCol w:w="1872"/>
+        <w:gridCol w:w="1872"/>
+        <w:gridCol w:w="1872"/>
+        <w:gridCol w:w="1872"/>
+      </w:tblGrid>
+      <w:tr>
+        <w:tc>
+          <w:tcPr>
+            <w:tcW w:type="dxa" w:w="1872"/>
+          </w:tcPr>
+          <w:p>
+            <w:pPr>
+              <w:jc w:val="left"/>
+            </w:pPr>
+            <w:r>
+              <w:rPr>
+                <w:b/>
+                <w:color w:val="0F172A"/>
+                <w:sz w:val="19"/>
+              </w:rPr>
+              <w:t>Threat Classification Label</w:t>
+            </w:r>
+          </w:p>
+        </w:tc>
+        <w:tc>
+          <w:tcPr>
+            <w:tcW w:type="dxa" w:w="1872"/>
+          </w:tcPr>
+          <w:p>
+            <w:pPr>
+              <w:jc w:val="left"/>
+            </w:pPr>
+            <w:r>
+              <w:rPr>
+                <w:b/>
+                <w:color w:val="0F172A"/>
+                <w:sz w:val="19"/>
+              </w:rPr>
+              <w:t>Raw CSV Count</w:t>
+            </w:r>
+          </w:p>
+        </w:tc>
+        <w:tc>
+          <w:tcPr>
+            <w:tcW w:type="dxa" w:w="1872"/>
+          </w:tcPr>
+          <w:p>
+            <w:pPr>
+              <w:jc w:val="left"/>
+            </w:pPr>
+            <w:r>
+              <w:rPr>
+                <w:b/>
+                <w:color w:val="0F172A"/>
+                <w:sz w:val="19"/>
+              </w:rPr>
+              <w:t>DB Loaded Count</w:t>
+            </w:r>
+          </w:p>
+        </w:tc>
+        <w:tc>
+          <w:tcPr>
+            <w:tcW w:type="dxa" w:w="1872"/>
+          </w:tcPr>
+          <w:p>
+            <w:pPr>
+              <w:jc w:val="left"/>
+            </w:pPr>
+            <w:r>
+              <w:rPr>
+                <w:b/>
+                <w:color w:val="0F172A"/>
+                <w:sz w:val="19"/>
+              </w:rPr>
+              <w:t>Net Discrepancy (Dropped)</w:t>
+            </w:r>
+          </w:p>
+        </w:tc>
+        <w:tc>
+          <w:tcPr>
+            <w:tcW w:type="dxa" w:w="1872"/>
+          </w:tcPr>
+          <w:p>
+            <w:pPr>
+              <w:jc w:val="left"/>
+            </w:pPr>
+            <w:r>
+              <w:rPr>
+                <w:b/>
+                <w:color w:val="0F172A"/>
+                <w:sz w:val="19"/>
+              </w:rPr>
+              <w:t>Primary Cause of Discrepancy</w:t>
+            </w:r>
+          </w:p>
+        </w:tc>
+      </w:tr>
+      <w:tr>
+        <w:tc>
+          <w:tcPr>
+            <w:tcW w:type="dxa" w:w="1872"/>
+          </w:tcPr>
+          <w:p>
+            <w:pPr>
+              <w:jc w:val="left"/>
+            </w:pPr>
+            <w:r>
+              <w:rPr>
+                <w:sz w:val="18"/>
+              </w:rPr>
+              <w:t>**BENIGN**</w:t>
+            </w:r>
+          </w:p>
+        </w:tc>
+        <w:tc>
+          <w:tcPr>
+            <w:tcW w:type="dxa" w:w="1872"/>
+          </w:tcPr>
+          <w:p>
+            <w:pPr>
+              <w:jc w:val="left"/>
+            </w:pPr>
+            <w:r>
+              <w:rPr>
+                <w:sz w:val="18"/>
+              </w:rPr>
+              <w:t>2,273,097</w:t>
+            </w:r>
+          </w:p>
+        </w:tc>
+        <w:tc>
+          <w:tcPr>
+            <w:tcW w:type="dxa" w:w="1872"/>
+          </w:tcPr>
+          <w:p>
+            <w:pPr>
+              <w:jc w:val="left"/>
+            </w:pPr>
+            <w:r>
+              <w:rPr>
+                <w:sz w:val="18"/>
+              </w:rPr>
+              <w:t>2,170,865</w:t>
+            </w:r>
+          </w:p>
+        </w:tc>
+        <w:tc>
+          <w:tcPr>
+            <w:tcW w:type="dxa" w:w="1872"/>
+          </w:tcPr>
+          <w:p>
+            <w:pPr>
+              <w:jc w:val="left"/>
+            </w:pPr>
+            <w:r>
+              <w:rPr>
+                <w:sz w:val="18"/>
+              </w:rPr>
+              <w:t>102,232</w:t>
+            </w:r>
+          </w:p>
+        </w:tc>
+        <w:tc>
+          <w:tcPr>
+            <w:tcW w:type="dxa" w:w="1872"/>
+          </w:tcPr>
+          <w:p>
+            <w:pPr>
+              <w:jc w:val="left"/>
+            </w:pPr>
+            <w:r>
+              <w:rPr>
+                <w:sz w:val="18"/>
+              </w:rPr>
+              <w:t>Duplicate operational/ping flows; missing NaN metrics</w:t>
+            </w:r>
+          </w:p>
+        </w:tc>
+      </w:tr>
+      <w:tr>
+        <w:tc>
+          <w:tcPr>
+            <w:tcW w:type="dxa" w:w="1872"/>
+          </w:tcPr>
+          <w:p>
+            <w:pPr>
+              <w:jc w:val="left"/>
+            </w:pPr>
+            <w:r>
+              <w:rPr>
+                <w:sz w:val="18"/>
+              </w:rPr>
+              <w:t>**DoS Hulk**</w:t>
+            </w:r>
+          </w:p>
+        </w:tc>
+        <w:tc>
+          <w:tcPr>
+            <w:tcW w:type="dxa" w:w="1872"/>
+          </w:tcPr>
+          <w:p>
+            <w:pPr>
+              <w:jc w:val="left"/>
+            </w:pPr>
+            <w:r>
+              <w:rPr>
+                <w:sz w:val="18"/>
+              </w:rPr>
+              <w:t>231,073</w:t>
+            </w:r>
+          </w:p>
+        </w:tc>
+        <w:tc>
+          <w:tcPr>
+            <w:tcW w:type="dxa" w:w="1872"/>
+          </w:tcPr>
+          <w:p>
+            <w:pPr>
+              <w:jc w:val="left"/>
+            </w:pPr>
+            <w:r>
+              <w:rPr>
+                <w:sz w:val="18"/>
+              </w:rPr>
+              <w:t>173,559</w:t>
+            </w:r>
+          </w:p>
+        </w:tc>
+        <w:tc>
+          <w:tcPr>
+            <w:tcW w:type="dxa" w:w="1872"/>
+          </w:tcPr>
+          <w:p>
+            <w:pPr>
+              <w:jc w:val="left"/>
+            </w:pPr>
+            <w:r>
+              <w:rPr>
+                <w:sz w:val="18"/>
+              </w:rPr>
+              <w:t>57,514</w:t>
+            </w:r>
+          </w:p>
+        </w:tc>
+        <w:tc>
+          <w:tcPr>
+            <w:tcW w:type="dxa" w:w="1872"/>
+          </w:tcPr>
+          <w:p>
+            <w:pPr>
+              <w:jc w:val="left"/>
+            </w:pPr>
+            <w:r>
+              <w:rPr>
+                <w:sz w:val="18"/>
+              </w:rPr>
+              <w:t>High-volume repetitive HTTP GET flood packet duplicates</w:t>
+            </w:r>
+          </w:p>
+        </w:tc>
+      </w:tr>
+      <w:tr>
+        <w:tc>
+          <w:tcPr>
+            <w:tcW w:type="dxa" w:w="1872"/>
+          </w:tcPr>
+          <w:p>
+            <w:pPr>
+              <w:jc w:val="left"/>
+            </w:pPr>
+            <w:r>
+              <w:rPr>
+                <w:sz w:val="18"/>
+              </w:rPr>
+              <w:t>**PortScan**</w:t>
+            </w:r>
+          </w:p>
+        </w:tc>
+        <w:tc>
+          <w:tcPr>
+            <w:tcW w:type="dxa" w:w="1872"/>
+          </w:tcPr>
+          <w:p>
+            <w:pPr>
+              <w:jc w:val="left"/>
+            </w:pPr>
+            <w:r>
+              <w:rPr>
+                <w:sz w:val="18"/>
+              </w:rPr>
+              <w:t>158,930</w:t>
+            </w:r>
+          </w:p>
+        </w:tc>
+        <w:tc>
+          <w:tcPr>
+            <w:tcW w:type="dxa" w:w="1872"/>
+          </w:tcPr>
+          <w:p>
+            <w:pPr>
+              <w:jc w:val="left"/>
+            </w:pPr>
+            <w:r>
+              <w:rPr>
+                <w:sz w:val="18"/>
+              </w:rPr>
+              <w:t>109,418</w:t>
+            </w:r>
+          </w:p>
+        </w:tc>
+        <w:tc>
+          <w:tcPr>
+            <w:tcW w:type="dxa" w:w="1872"/>
+          </w:tcPr>
+          <w:p>
+            <w:pPr>
+              <w:jc w:val="left"/>
+            </w:pPr>
+            <w:r>
+              <w:rPr>
+                <w:sz w:val="18"/>
+              </w:rPr>
+              <w:t>49,512</w:t>
+            </w:r>
+          </w:p>
+        </w:tc>
+        <w:tc>
+          <w:tcPr>
+            <w:tcW w:type="dxa" w:w="1872"/>
+          </w:tcPr>
+          <w:p>
+            <w:pPr>
+              <w:jc w:val="left"/>
+            </w:pPr>
+            <w:r>
+              <w:rPr>
+                <w:sz w:val="18"/>
+              </w:rPr>
+              <w:t>Rapid SYN probe packets to adjacent ports with identical length</w:t>
+            </w:r>
+          </w:p>
+        </w:tc>
+      </w:tr>
+      <w:tr>
+        <w:tc>
+          <w:tcPr>
+            <w:tcW w:type="dxa" w:w="1872"/>
+          </w:tcPr>
+          <w:p>
+            <w:pPr>
+              <w:jc w:val="left"/>
+            </w:pPr>
+            <w:r>
+              <w:rPr>
+                <w:sz w:val="18"/>
+              </w:rPr>
+              <w:t>**SSH-Patator**</w:t>
+            </w:r>
+          </w:p>
+        </w:tc>
+        <w:tc>
+          <w:tcPr>
+            <w:tcW w:type="dxa" w:w="1872"/>
+          </w:tcPr>
+          <w:p>
+            <w:pPr>
+              <w:jc w:val="left"/>
+            </w:pPr>
+            <w:r>
+              <w:rPr>
+                <w:sz w:val="18"/>
+              </w:rPr>
+              <w:t>5,897</w:t>
+            </w:r>
+          </w:p>
+        </w:tc>
+        <w:tc>
+          <w:tcPr>
+            <w:tcW w:type="dxa" w:w="1872"/>
+          </w:tcPr>
+          <w:p>
+            <w:pPr>
+              <w:jc w:val="left"/>
+            </w:pPr>
+            <w:r>
+              <w:rPr>
+                <w:sz w:val="18"/>
+              </w:rPr>
+              <w:t>3,442</w:t>
+            </w:r>
+          </w:p>
+        </w:tc>
+        <w:tc>
+          <w:tcPr>
+            <w:tcW w:type="dxa" w:w="1872"/>
+          </w:tcPr>
+          <w:p>
+            <w:pPr>
+              <w:jc w:val="left"/>
+            </w:pPr>
+            <w:r>
+              <w:rPr>
+                <w:sz w:val="18"/>
+              </w:rPr>
+              <w:t>2,455</w:t>
+            </w:r>
+          </w:p>
+        </w:tc>
+        <w:tc>
+          <w:tcPr>
+            <w:tcW w:type="dxa" w:w="1872"/>
+          </w:tcPr>
+          <w:p>
+            <w:pPr>
+              <w:jc w:val="left"/>
+            </w:pPr>
+            <w:r>
+              <w:rPr>
+                <w:sz w:val="18"/>
+              </w:rPr>
+              <w:t>Repetitive automated SSH dictionary credential attempts</w:t>
+            </w:r>
+          </w:p>
+        </w:tc>
+      </w:tr>
+      <w:tr>
+        <w:tc>
+          <w:tcPr>
+            <w:tcW w:type="dxa" w:w="1872"/>
+          </w:tcPr>
+          <w:p>
+            <w:pPr>
+              <w:jc w:val="left"/>
+            </w:pPr>
+            <w:r>
+              <w:rPr>
+                <w:sz w:val="18"/>
+              </w:rPr>
+              <w:t>**FTP-Patator**</w:t>
+            </w:r>
+          </w:p>
+        </w:tc>
+        <w:tc>
+          <w:tcPr>
+            <w:tcW w:type="dxa" w:w="1872"/>
+          </w:tcPr>
+          <w:p>
+            <w:pPr>
+              <w:jc w:val="left"/>
+            </w:pPr>
+            <w:r>
+              <w:rPr>
+                <w:sz w:val="18"/>
+              </w:rPr>
+              <w:t>7,938</w:t>
+            </w:r>
+          </w:p>
+        </w:tc>
+        <w:tc>
+          <w:tcPr>
+            <w:tcW w:type="dxa" w:w="1872"/>
+          </w:tcPr>
+          <w:p>
+            <w:pPr>
+              <w:jc w:val="left"/>
+            </w:pPr>
+            <w:r>
+              <w:rPr>
+                <w:sz w:val="18"/>
+              </w:rPr>
+              <w:t>5,931</w:t>
+            </w:r>
+          </w:p>
+        </w:tc>
+        <w:tc>
+          <w:tcPr>
+            <w:tcW w:type="dxa" w:w="1872"/>
+          </w:tcPr>
+          <w:p>
+            <w:pPr>
+              <w:jc w:val="left"/>
+            </w:pPr>
+            <w:r>
+              <w:rPr>
+                <w:sz w:val="18"/>
+              </w:rPr>
+              <w:t>2,007</w:t>
+            </w:r>
+          </w:p>
+        </w:tc>
+        <w:tc>
+          <w:tcPr>
+            <w:tcW w:type="dxa" w:w="1872"/>
+          </w:tcPr>
+          <w:p>
+            <w:pPr>
+              <w:jc w:val="left"/>
+            </w:pPr>
+            <w:r>
+              <w:rPr>
+                <w:sz w:val="18"/>
+              </w:rPr>
+              <w:t>Repeated automated FTP login retry flows</w:t>
+            </w:r>
+          </w:p>
+        </w:tc>
+      </w:tr>
+      <w:tr>
+        <w:tc>
+          <w:tcPr>
+            <w:tcW w:type="dxa" w:w="1872"/>
+          </w:tcPr>
+          <w:p>
+            <w:pPr>
+              <w:jc w:val="left"/>
+            </w:pPr>
+            <w:r>
+              <w:rPr>
+                <w:sz w:val="18"/>
+              </w:rPr>
+              <w:t>**DoS slowloris**</w:t>
+            </w:r>
+          </w:p>
+        </w:tc>
+        <w:tc>
+          <w:tcPr>
+            <w:tcW w:type="dxa" w:w="1872"/>
+          </w:tcPr>
+          <w:p>
+            <w:pPr>
+              <w:jc w:val="left"/>
+            </w:pPr>
+            <w:r>
+              <w:rPr>
+                <w:sz w:val="18"/>
+              </w:rPr>
+              <w:t>5,796</w:t>
+            </w:r>
+          </w:p>
+        </w:tc>
+        <w:tc>
+          <w:tcPr>
+            <w:tcW w:type="dxa" w:w="1872"/>
+          </w:tcPr>
+          <w:p>
+            <w:pPr>
+              <w:jc w:val="left"/>
+            </w:pPr>
+            <w:r>
+              <w:rPr>
+                <w:sz w:val="18"/>
+              </w:rPr>
+              <w:t>5,385</w:t>
+            </w:r>
+          </w:p>
+        </w:tc>
+        <w:tc>
+          <w:tcPr>
+            <w:tcW w:type="dxa" w:w="1872"/>
+          </w:tcPr>
+          <w:p>
+            <w:pPr>
+              <w:jc w:val="left"/>
+            </w:pPr>
+            <w:r>
+              <w:rPr>
+                <w:sz w:val="18"/>
+              </w:rPr>
+              <w:t>411</w:t>
+            </w:r>
+          </w:p>
+        </w:tc>
+        <w:tc>
+          <w:tcPr>
+            <w:tcW w:type="dxa" w:w="1872"/>
+          </w:tcPr>
+          <w:p>
+            <w:pPr>
+              <w:jc w:val="left"/>
+            </w:pPr>
+            <w:r>
+              <w:rPr>
+                <w:sz w:val="18"/>
+              </w:rPr>
+              <w:t>Keep-alive probe duplicates</w:t>
+            </w:r>
+          </w:p>
+        </w:tc>
+      </w:tr>
+      <w:tr>
+        <w:tc>
+          <w:tcPr>
+            <w:tcW w:type="dxa" w:w="1872"/>
+          </w:tcPr>
+          <w:p>
+            <w:pPr>
+              <w:jc w:val="left"/>
+            </w:pPr>
+            <w:r>
+              <w:rPr>
+                <w:sz w:val="18"/>
+              </w:rPr>
+              <w:t>**DoS Slowhttptest**</w:t>
+            </w:r>
+          </w:p>
+        </w:tc>
+        <w:tc>
+          <w:tcPr>
+            <w:tcW w:type="dxa" w:w="1872"/>
+          </w:tcPr>
+          <w:p>
+            <w:pPr>
+              <w:jc w:val="left"/>
+            </w:pPr>
+            <w:r>
+              <w:rPr>
+                <w:sz w:val="18"/>
+              </w:rPr>
+              <w:t>5,499</w:t>
+            </w:r>
+          </w:p>
+        </w:tc>
+        <w:tc>
+          <w:tcPr>
+            <w:tcW w:type="dxa" w:w="1872"/>
+          </w:tcPr>
+          <w:p>
+            <w:pPr>
+              <w:jc w:val="left"/>
+            </w:pPr>
+            <w:r>
+              <w:rPr>
+                <w:sz w:val="18"/>
+              </w:rPr>
+              <w:t>5,228</w:t>
+            </w:r>
+          </w:p>
+        </w:tc>
+        <w:tc>
+          <w:tcPr>
+            <w:tcW w:type="dxa" w:w="1872"/>
+          </w:tcPr>
+          <w:p>
+            <w:pPr>
+              <w:jc w:val="left"/>
+            </w:pPr>
+            <w:r>
+              <w:rPr>
+                <w:sz w:val="18"/>
+              </w:rPr>
+              <w:t>271</w:t>
+            </w:r>
+          </w:p>
+        </w:tc>
+        <w:tc>
+          <w:tcPr>
+            <w:tcW w:type="dxa" w:w="1872"/>
+          </w:tcPr>
+          <w:p>
+            <w:pPr>
+              <w:jc w:val="left"/>
+            </w:pPr>
+            <w:r>
+              <w:rPr>
+                <w:sz w:val="18"/>
+              </w:rPr>
+              <w:t>Slow-read packet duplicates</w:t>
+            </w:r>
+          </w:p>
+        </w:tc>
+      </w:tr>
+      <w:tr>
+        <w:tc>
+          <w:tcPr>
+            <w:tcW w:type="dxa" w:w="1872"/>
+          </w:tcPr>
+          <w:p>
+            <w:pPr>
+              <w:jc w:val="left"/>
+            </w:pPr>
+            <w:r>
+              <w:rPr>
+                <w:sz w:val="18"/>
+              </w:rPr>
+              <w:t>**Web Attack - Brute Force**</w:t>
+            </w:r>
+          </w:p>
+        </w:tc>
+        <w:tc>
+          <w:tcPr>
+            <w:tcW w:type="dxa" w:w="1872"/>
+          </w:tcPr>
+          <w:p>
+            <w:pPr>
+              <w:jc w:val="left"/>
+            </w:pPr>
+            <w:r>
+              <w:rPr>
+                <w:sz w:val="18"/>
+              </w:rPr>
+              <w:t>1,507</w:t>
+            </w:r>
+          </w:p>
+        </w:tc>
+        <w:tc>
+          <w:tcPr>
+            <w:tcW w:type="dxa" w:w="1872"/>
+          </w:tcPr>
+          <w:p>
+            <w:pPr>
+              <w:jc w:val="left"/>
+            </w:pPr>
+            <w:r>
+              <w:rPr>
+                <w:sz w:val="18"/>
+              </w:rPr>
+              <w:t>1,470</w:t>
+            </w:r>
+          </w:p>
+        </w:tc>
+        <w:tc>
+          <w:tcPr>
+            <w:tcW w:type="dxa" w:w="1872"/>
+          </w:tcPr>
+          <w:p>
+            <w:pPr>
+              <w:jc w:val="left"/>
+            </w:pPr>
+            <w:r>
+              <w:rPr>
+                <w:sz w:val="18"/>
+              </w:rPr>
+              <w:t>37</w:t>
+            </w:r>
+          </w:p>
+        </w:tc>
+        <w:tc>
+          <w:tcPr>
+            <w:tcW w:type="dxa" w:w="1872"/>
+          </w:tcPr>
+          <w:p>
+            <w:pPr>
+              <w:jc w:val="left"/>
+            </w:pPr>
+            <w:r>
+              <w:rPr>
+                <w:sz w:val="18"/>
+              </w:rPr>
+              <w:t>Repetitive POST credential attempts</w:t>
+            </w:r>
+          </w:p>
+        </w:tc>
+      </w:tr>
+      <w:tr>
+        <w:tc>
+          <w:tcPr>
+            <w:tcW w:type="dxa" w:w="1872"/>
+          </w:tcPr>
+          <w:p>
+            <w:pPr>
+              <w:jc w:val="left"/>
+            </w:pPr>
+            <w:r>
+              <w:rPr>
+                <w:sz w:val="18"/>
+              </w:rPr>
+              <w:t>**Bot**</w:t>
+            </w:r>
+          </w:p>
+        </w:tc>
+        <w:tc>
+          <w:tcPr>
+            <w:tcW w:type="dxa" w:w="1872"/>
+          </w:tcPr>
+          <w:p>
+            <w:pPr>
+              <w:jc w:val="left"/>
+            </w:pPr>
+            <w:r>
+              <w:rPr>
+                <w:sz w:val="18"/>
+              </w:rPr>
+              <w:t>1,966</w:t>
+            </w:r>
+          </w:p>
+        </w:tc>
+        <w:tc>
+          <w:tcPr>
+            <w:tcW w:type="dxa" w:w="1872"/>
+          </w:tcPr>
+          <w:p>
+            <w:pPr>
+              <w:jc w:val="left"/>
+            </w:pPr>
+            <w:r>
+              <w:rPr>
+                <w:sz w:val="18"/>
+              </w:rPr>
+              <w:t>1,948</w:t>
+            </w:r>
+          </w:p>
+        </w:tc>
+        <w:tc>
+          <w:tcPr>
+            <w:tcW w:type="dxa" w:w="1872"/>
+          </w:tcPr>
+          <w:p>
+            <w:pPr>
+              <w:jc w:val="left"/>
+            </w:pPr>
+            <w:r>
+              <w:rPr>
+                <w:sz w:val="18"/>
+              </w:rPr>
+              <w:t>18</w:t>
+            </w:r>
+          </w:p>
+        </w:tc>
+        <w:tc>
+          <w:tcPr>
+            <w:tcW w:type="dxa" w:w="1872"/>
+          </w:tcPr>
+          <w:p>
+            <w:pPr>
+              <w:jc w:val="left"/>
+            </w:pPr>
+            <w:r>
+              <w:rPr>
+                <w:sz w:val="18"/>
+              </w:rPr>
+              <w:t>Repeated heartbeat beaconing frames</w:t>
+            </w:r>
+          </w:p>
+        </w:tc>
+      </w:tr>
+      <w:tr>
+        <w:tc>
+          <w:tcPr>
+            <w:tcW w:type="dxa" w:w="1872"/>
+          </w:tcPr>
+          <w:p>
+            <w:pPr>
+              <w:jc w:val="left"/>
+            </w:pPr>
+            <w:r>
+              <w:rPr>
+                <w:sz w:val="18"/>
+              </w:rPr>
+              <w:t>**DDoS**</w:t>
+            </w:r>
+          </w:p>
+        </w:tc>
+        <w:tc>
+          <w:tcPr>
+            <w:tcW w:type="dxa" w:w="1872"/>
+          </w:tcPr>
+          <w:p>
+            <w:pPr>
+              <w:jc w:val="left"/>
+            </w:pPr>
+            <w:r>
+              <w:rPr>
+                <w:sz w:val="18"/>
+              </w:rPr>
+              <w:t>128,027</w:t>
+            </w:r>
+          </w:p>
+        </w:tc>
+        <w:tc>
+          <w:tcPr>
+            <w:tcW w:type="dxa" w:w="1872"/>
+          </w:tcPr>
+          <w:p>
+            <w:pPr>
+              <w:jc w:val="left"/>
+            </w:pPr>
+            <w:r>
+              <w:rPr>
+                <w:sz w:val="18"/>
+              </w:rPr>
+              <w:t>128,014</w:t>
+            </w:r>
+          </w:p>
+        </w:tc>
+        <w:tc>
+          <w:tcPr>
+            <w:tcW w:type="dxa" w:w="1872"/>
+          </w:tcPr>
+          <w:p>
+            <w:pPr>
+              <w:jc w:val="left"/>
+            </w:pPr>
+            <w:r>
+              <w:rPr>
+                <w:sz w:val="18"/>
+              </w:rPr>
+              <w:t>13</w:t>
+            </w:r>
+          </w:p>
+        </w:tc>
+        <w:tc>
+          <w:tcPr>
+            <w:tcW w:type="dxa" w:w="1872"/>
+          </w:tcPr>
+          <w:p>
+            <w:pPr>
+              <w:jc w:val="left"/>
+            </w:pPr>
+            <w:r>
+              <w:rPr>
+                <w:sz w:val="18"/>
+              </w:rPr>
+              <w:t>High-rate volumetric flood packets</w:t>
+            </w:r>
+          </w:p>
+        </w:tc>
+      </w:tr>
+      <w:tr>
+        <w:tc>
+          <w:tcPr>
+            <w:tcW w:type="dxa" w:w="1872"/>
+          </w:tcPr>
+          <w:p>
+            <w:pPr>
+              <w:jc w:val="left"/>
+            </w:pPr>
+            <w:r>
+              <w:rPr>
+                <w:sz w:val="18"/>
+              </w:rPr>
+              <w:t>**DoS GoldenEye**</w:t>
+            </w:r>
+          </w:p>
+        </w:tc>
+        <w:tc>
+          <w:tcPr>
+            <w:tcW w:type="dxa" w:w="1872"/>
+          </w:tcPr>
+          <w:p>
+            <w:pPr>
+              <w:jc w:val="left"/>
+            </w:pPr>
+            <w:r>
+              <w:rPr>
+                <w:sz w:val="18"/>
+              </w:rPr>
+              <w:t>10,293</w:t>
+            </w:r>
+          </w:p>
+        </w:tc>
+        <w:tc>
+          <w:tcPr>
+            <w:tcW w:type="dxa" w:w="1872"/>
+          </w:tcPr>
+          <w:p>
+            <w:pPr>
+              <w:jc w:val="left"/>
+            </w:pPr>
+            <w:r>
+              <w:rPr>
+                <w:sz w:val="18"/>
+              </w:rPr>
+              <w:t>10,286</w:t>
+            </w:r>
+          </w:p>
+        </w:tc>
+        <w:tc>
+          <w:tcPr>
+            <w:tcW w:type="dxa" w:w="1872"/>
+          </w:tcPr>
+          <w:p>
+            <w:pPr>
+              <w:jc w:val="left"/>
+            </w:pPr>
+            <w:r>
+              <w:rPr>
+                <w:sz w:val="18"/>
+              </w:rPr>
+              <w:t>7</w:t>
+            </w:r>
+          </w:p>
+        </w:tc>
+        <w:tc>
+          <w:tcPr>
+            <w:tcW w:type="dxa" w:w="1872"/>
+          </w:tcPr>
+          <w:p>
+            <w:pPr>
+              <w:jc w:val="left"/>
+            </w:pPr>
+            <w:r>
+              <w:rPr>
+                <w:sz w:val="18"/>
+              </w:rPr>
+              <w:t>Repetitive HTTP keep-alive requests</w:t>
+            </w:r>
+          </w:p>
+        </w:tc>
+      </w:tr>
+      <w:tr>
+        <w:tc>
+          <w:tcPr>
+            <w:tcW w:type="dxa" w:w="1872"/>
+          </w:tcPr>
+          <w:p>
+            <w:pPr>
+              <w:jc w:val="left"/>
+            </w:pPr>
+            <w:r>
+              <w:rPr>
+                <w:sz w:val="18"/>
+              </w:rPr>
+              <w:t>**Web Attack - XSS**</w:t>
+            </w:r>
+          </w:p>
+        </w:tc>
+        <w:tc>
+          <w:tcPr>
+            <w:tcW w:type="dxa" w:w="1872"/>
+          </w:tcPr>
+          <w:p>
+            <w:pPr>
+              <w:jc w:val="left"/>
+            </w:pPr>
+            <w:r>
+              <w:rPr>
+                <w:sz w:val="18"/>
+              </w:rPr>
+              <w:t>652</w:t>
+            </w:r>
+          </w:p>
+        </w:tc>
+        <w:tc>
+          <w:tcPr>
+            <w:tcW w:type="dxa" w:w="1872"/>
+          </w:tcPr>
+          <w:p>
+            <w:pPr>
+              <w:jc w:val="left"/>
+            </w:pPr>
+            <w:r>
+              <w:rPr>
+                <w:sz w:val="18"/>
+              </w:rPr>
+              <w:t>652</w:t>
+            </w:r>
+          </w:p>
+        </w:tc>
+        <w:tc>
+          <w:tcPr>
+            <w:tcW w:type="dxa" w:w="1872"/>
+          </w:tcPr>
+          <w:p>
+            <w:pPr>
+              <w:jc w:val="left"/>
+            </w:pPr>
+            <w:r>
+              <w:rPr>
+                <w:sz w:val="18"/>
+              </w:rPr>
+              <w:t>0</w:t>
+            </w:r>
+          </w:p>
+        </w:tc>
+        <w:tc>
+          <w:tcPr>
+            <w:tcW w:type="dxa" w:w="1872"/>
+          </w:tcPr>
+          <w:p>
+            <w:pPr>
+              <w:jc w:val="left"/>
+            </w:pPr>
+            <w:r>
+              <w:rPr>
+                <w:sz w:val="18"/>
+              </w:rPr>
+              <w:t>100% preserved (zero missing, zero duplicates)</w:t>
+            </w:r>
+          </w:p>
+        </w:tc>
+      </w:tr>
+      <w:tr>
+        <w:tc>
+          <w:tcPr>
+            <w:tcW w:type="dxa" w:w="1872"/>
+          </w:tcPr>
+          <w:p>
+            <w:pPr>
+              <w:jc w:val="left"/>
+            </w:pPr>
+            <w:r>
+              <w:rPr>
+                <w:sz w:val="18"/>
+              </w:rPr>
+              <w:t>**Infiltration**</w:t>
+            </w:r>
+          </w:p>
+        </w:tc>
+        <w:tc>
+          <w:tcPr>
+            <w:tcW w:type="dxa" w:w="1872"/>
+          </w:tcPr>
+          <w:p>
+            <w:pPr>
+              <w:jc w:val="left"/>
+            </w:pPr>
+            <w:r>
+              <w:rPr>
+                <w:sz w:val="18"/>
+              </w:rPr>
+              <w:t>36</w:t>
+            </w:r>
+          </w:p>
+        </w:tc>
+        <w:tc>
+          <w:tcPr>
+            <w:tcW w:type="dxa" w:w="1872"/>
+          </w:tcPr>
+          <w:p>
+            <w:pPr>
+              <w:jc w:val="left"/>
+            </w:pPr>
+            <w:r>
+              <w:rPr>
+                <w:sz w:val="18"/>
+              </w:rPr>
+              <w:t>36</w:t>
+            </w:r>
+          </w:p>
+        </w:tc>
+        <w:tc>
+          <w:tcPr>
+            <w:tcW w:type="dxa" w:w="1872"/>
+          </w:tcPr>
+          <w:p>
+            <w:pPr>
+              <w:jc w:val="left"/>
+            </w:pPr>
+            <w:r>
+              <w:rPr>
+                <w:sz w:val="18"/>
+              </w:rPr>
+              <w:t>0</w:t>
+            </w:r>
+          </w:p>
+        </w:tc>
+        <w:tc>
+          <w:tcPr>
+            <w:tcW w:type="dxa" w:w="1872"/>
+          </w:tcPr>
+          <w:p>
+            <w:pPr>
+              <w:jc w:val="left"/>
+            </w:pPr>
+            <w:r>
+              <w:rPr>
+                <w:sz w:val="18"/>
+              </w:rPr>
+              <w:t>100% preserved (critical low-volume threat)</w:t>
+            </w:r>
+          </w:p>
+        </w:tc>
+      </w:tr>
+      <w:tr>
+        <w:tc>
+          <w:tcPr>
+            <w:tcW w:type="dxa" w:w="1872"/>
+          </w:tcPr>
+          <w:p>
+            <w:pPr>
+              <w:jc w:val="left"/>
+            </w:pPr>
+            <w:r>
+              <w:rPr>
+                <w:sz w:val="18"/>
+              </w:rPr>
+              <w:t>**Web Attack - Sql Injection**</w:t>
+            </w:r>
+          </w:p>
+        </w:tc>
+        <w:tc>
+          <w:tcPr>
+            <w:tcW w:type="dxa" w:w="1872"/>
+          </w:tcPr>
+          <w:p>
+            <w:pPr>
+              <w:jc w:val="left"/>
+            </w:pPr>
+            <w:r>
+              <w:rPr>
+                <w:sz w:val="18"/>
+              </w:rPr>
+              <w:t>21</w:t>
+            </w:r>
+          </w:p>
+        </w:tc>
+        <w:tc>
+          <w:tcPr>
+            <w:tcW w:type="dxa" w:w="1872"/>
+          </w:tcPr>
+          <w:p>
+            <w:pPr>
+              <w:jc w:val="left"/>
+            </w:pPr>
+            <w:r>
+              <w:rPr>
+                <w:sz w:val="18"/>
+              </w:rPr>
+              <w:t>21</w:t>
+            </w:r>
+          </w:p>
+        </w:tc>
+        <w:tc>
+          <w:tcPr>
+            <w:tcW w:type="dxa" w:w="1872"/>
+          </w:tcPr>
+          <w:p>
+            <w:pPr>
+              <w:jc w:val="left"/>
+            </w:pPr>
+            <w:r>
+              <w:rPr>
+                <w:sz w:val="18"/>
+              </w:rPr>
+              <w:t>0</w:t>
+            </w:r>
+          </w:p>
+        </w:tc>
+        <w:tc>
+          <w:tcPr>
+            <w:tcW w:type="dxa" w:w="1872"/>
+          </w:tcPr>
+          <w:p>
+            <w:pPr>
+              <w:jc w:val="left"/>
+            </w:pPr>
+            <w:r>
+              <w:rPr>
+                <w:sz w:val="18"/>
+              </w:rPr>
+              <w:t>100% preserved (critical low-volume threat)</w:t>
+            </w:r>
+          </w:p>
+        </w:tc>
+      </w:tr>
+      <w:tr>
+        <w:tc>
+          <w:tcPr>
+            <w:tcW w:type="dxa" w:w="1872"/>
+          </w:tcPr>
+          <w:p>
+            <w:pPr>
+              <w:jc w:val="left"/>
+            </w:pPr>
+            <w:r>
+              <w:rPr>
+                <w:sz w:val="18"/>
+              </w:rPr>
+              <w:t>**Heartbleed**</w:t>
+            </w:r>
+          </w:p>
+        </w:tc>
+        <w:tc>
+          <w:tcPr>
+            <w:tcW w:type="dxa" w:w="1872"/>
+          </w:tcPr>
+          <w:p>
+            <w:pPr>
+              <w:jc w:val="left"/>
+            </w:pPr>
+            <w:r>
+              <w:rPr>
+                <w:sz w:val="18"/>
+              </w:rPr>
+              <w:t>11</w:t>
+            </w:r>
+          </w:p>
+        </w:tc>
+        <w:tc>
+          <w:tcPr>
+            <w:tcW w:type="dxa" w:w="1872"/>
+          </w:tcPr>
+          <w:p>
+            <w:pPr>
+              <w:jc w:val="left"/>
+            </w:pPr>
+            <w:r>
+              <w:rPr>
+                <w:sz w:val="18"/>
+              </w:rPr>
+              <w:t>11</w:t>
+            </w:r>
+          </w:p>
+        </w:tc>
+        <w:tc>
+          <w:tcPr>
+            <w:tcW w:type="dxa" w:w="1872"/>
+          </w:tcPr>
+          <w:p>
+            <w:pPr>
+              <w:jc w:val="left"/>
+            </w:pPr>
+            <w:r>
+              <w:rPr>
+                <w:sz w:val="18"/>
+              </w:rPr>
+              <w:t>0</w:t>
+            </w:r>
+          </w:p>
+        </w:tc>
+        <w:tc>
+          <w:tcPr>
+            <w:tcW w:type="dxa" w:w="1872"/>
+          </w:tcPr>
+          <w:p>
+            <w:pPr>
+              <w:jc w:val="left"/>
+            </w:pPr>
+            <w:r>
+              <w:rPr>
+                <w:sz w:val="18"/>
+              </w:rPr>
+              <w:t>100% preserved (critical low-volume threat)</w:t>
+            </w:r>
+          </w:p>
+        </w:tc>
+      </w:tr>
+      <w:tr>
+        <w:tc>
+          <w:tcPr>
+            <w:tcW w:type="dxa" w:w="1872"/>
+          </w:tcPr>
+          <w:p>
+            <w:pPr>
+              <w:jc w:val="left"/>
+            </w:pPr>
+            <w:r>
+              <w:rPr>
+                <w:sz w:val="18"/>
+              </w:rPr>
+              <w:t>**TOTAL**</w:t>
+            </w:r>
+          </w:p>
+        </w:tc>
+        <w:tc>
+          <w:tcPr>
+            <w:tcW w:type="dxa" w:w="1872"/>
+          </w:tcPr>
+          <w:p>
+            <w:pPr>
+              <w:jc w:val="left"/>
+            </w:pPr>
+            <w:r>
+              <w:rPr>
+                <w:sz w:val="18"/>
+              </w:rPr>
+              <w:t>**2,830,743**</w:t>
+            </w:r>
+          </w:p>
+        </w:tc>
+        <w:tc>
+          <w:tcPr>
+            <w:tcW w:type="dxa" w:w="1872"/>
+          </w:tcPr>
+          <w:p>
+            <w:pPr>
+              <w:jc w:val="left"/>
+            </w:pPr>
+            <w:r>
+              <w:rPr>
+                <w:sz w:val="18"/>
+              </w:rPr>
+              <w:t>**2,616,266**</w:t>
+            </w:r>
+          </w:p>
+        </w:tc>
+        <w:tc>
+          <w:tcPr>
+            <w:tcW w:type="dxa" w:w="1872"/>
+          </w:tcPr>
+          <w:p>
+            <w:pPr>
+              <w:jc w:val="left"/>
+            </w:pPr>
+            <w:r>
+              <w:rPr>
+                <w:sz w:val="18"/>
+              </w:rPr>
+              <w:t>**214,477**</w:t>
+            </w:r>
+          </w:p>
+        </w:tc>
+        <w:tc>
+          <w:tcPr>
+            <w:tcW w:type="dxa" w:w="1872"/>
+          </w:tcPr>
+          <w:p>
+            <w:pPr>
+              <w:jc w:val="left"/>
+            </w:pPr>
+            <w:r>
+              <w:rPr>
+                <w:sz w:val="18"/>
+              </w:rPr>
+              <w:t>Exactly $2,830,743 - 214,477 = 2,616,266$</w:t>
+            </w:r>
+          </w:p>
+        </w:tc>
+      </w:tr>
+    </w:tbl>
+    <w:p/>
+    <w:p>
+      <w:pPr>
+        <w:pStyle w:val="Heading3"/>
+        <w:spacing w:before="200" w:after="40"/>
+      </w:pPr>
+      <w:r>
+        <w:rPr>
+          <w:rFonts w:ascii="Calibri" w:hAnsi="Calibri"/>
+          <w:color w:val="0F766E"/>
+        </w:rPr>
+        <w:t>6.2 Cross-Chunk Deduplication Analysis &amp; Memory Trade-off</w:t>
+      </w:r>
+    </w:p>
+    <w:p>
+      <w:pPr>
+        <w:pStyle w:val="ListBullet"/>
+        <w:spacing w:after="40"/>
+      </w:pPr>
+      <w:r/>
+      <w:r>
+        <w:rPr>
+          <w:b/>
+        </w:rPr>
+        <w:t>Architectural Scope:</w:t>
+      </w:r>
+      <w:r>
+        <w:t xml:space="preserve"> In accordance with strict memory bounds for large datasets, deduplication in `transform_chunk()` is executed </w:t>
+      </w:r>
+      <w:r>
+        <w:rPr>
+          <w:b/>
+        </w:rPr>
+        <w:t>within each 200,000-row chunk</w:t>
+      </w:r>
+      <w:r>
+        <w:t xml:space="preserve">. This bounded Python RAM to </w:t>
+      </w:r>
+      <w:r>
+        <w:rPr>
+          <w:b/>
+        </w:rPr>
+        <w:t>643.6 MB</w:t>
+      </w:r>
+      <w:r>
+        <w:t xml:space="preserve"> and removed </w:t>
+      </w:r>
+      <w:r>
+        <w:rPr>
+          <w:b/>
+        </w:rPr>
+        <w:t>211,497 intra-chunk duplicates</w:t>
+      </w:r>
+      <w:r>
+        <w:t>.</w:t>
+      </w:r>
+    </w:p>
+    <w:p>
+      <w:pPr>
+        <w:pStyle w:val="ListBullet"/>
+        <w:spacing w:after="40"/>
+      </w:pPr>
+      <w:r/>
+      <w:r>
+        <w:rPr>
+          <w:b/>
+        </w:rPr>
+        <w:t>Empirical Measurement:</w:t>
+      </w:r>
+      <w:r>
+        <w:t xml:space="preserve"> An exact database-wide verification query across all 15 connection attributes was executed against PostgreSQL. It revealed that </w:t>
+      </w:r>
+      <w:r>
+        <w:rPr>
+          <w:b/>
+        </w:rPr>
+        <w:t>240,988 duplicate rows within the same source files (9.21%)</w:t>
+      </w:r>
+      <w:r>
+        <w:t xml:space="preserve"> and </w:t>
+      </w:r>
+      <w:r>
+        <w:rPr>
+          <w:b/>
+        </w:rPr>
+        <w:t>338,655 duplicate rows globally across all files (12.94%)</w:t>
+      </w:r>
+      <w:r>
+        <w:t xml:space="preserve"> remain in the database because identical flow signatures crossed 200,000-row chunk boundaries or occurred on multiple days.</w:t>
+      </w:r>
+    </w:p>
+    <w:p>
+      <w:pPr>
+        <w:pStyle w:val="ListBullet"/>
+        <w:spacing w:after="40"/>
+      </w:pPr>
+      <w:r/>
+      <w:r>
+        <w:rPr>
+          <w:b/>
+        </w:rPr>
+        <w:t>Trade-off Analysis:</w:t>
+      </w:r>
+      <w:r>
+        <w:t xml:space="preserve"> Purging cross-chunk duplicates requires either maintaining an in-memory Bloom filter/hash set of seen flow fingerprints across all 2.83M rows or executing post-load SQL deduplication in PostgreSQL. In this baseline pipeline, per-chunk deduplication was prioritized to preserve bounded memory.</w:t>
+      </w:r>
+    </w:p>
+    <w:p>
+      <w:pPr>
+        <w:pStyle w:val="Heading2"/>
+        <w:spacing w:before="240" w:after="80"/>
+      </w:pPr>
+      <w:r>
+        <w:rPr>
+          <w:rFonts w:ascii="Calibri" w:hAnsi="Calibri"/>
+          <w:color w:val="1E3A8A"/>
+        </w:rPr>
         <w:t>7. Business Analytics &amp; Threat Intelligence Findings</w:t>
       </w:r>
     </w:p>
@@ -1930,22 +4651,26 @@
     <w:p>
       <w:pPr>
         <w:pStyle w:val="Heading3"/>
-        <w:spacing w:before="160" w:after="40"/>
+        <w:spacing w:before="200" w:after="40"/>
       </w:pPr>
       <w:r>
+        <w:rPr>
+          <w:rFonts w:ascii="Calibri" w:hAnsi="Calibri"/>
+          <w:color w:val="0F766E"/>
+        </w:rPr>
         <w:t>7.1 Attack vs. Benign Traffic Share</w:t>
       </w:r>
     </w:p>
     <w:p>
       <w:pPr>
-        <w:spacing w:before="80" w:after="120"/>
-        <w:ind w:left="576"/>
+        <w:spacing w:before="60" w:after="80"/>
+        <w:ind w:left="432"/>
       </w:pPr>
       <w:r>
         <w:rPr>
           <w:rFonts w:ascii="Consolas" w:hAnsi="Consolas"/>
-          <w:color w:val="1E293B"/>
-          <w:sz w:val="18"/>
+          <w:color w:val="0F172A"/>
+          <w:sz w:val="17"/>
         </w:rPr>
         <w:t>+------------------------------+--------------+---------------+-----------------------+</w:t>
         <w:br/>
@@ -1980,22 +4705,26 @@
     <w:p>
       <w:pPr>
         <w:pStyle w:val="Heading3"/>
-        <w:spacing w:before="160" w:after="40"/>
+        <w:spacing w:before="200" w:after="40"/>
       </w:pPr>
       <w:r>
+        <w:rPr>
+          <w:rFonts w:ascii="Calibri" w:hAnsi="Calibri"/>
+          <w:color w:val="0F766E"/>
+        </w:rPr>
         <w:t>7.2 Top 10 Targeted Destination Ports Under Attack</w:t>
       </w:r>
     </w:p>
     <w:p>
       <w:pPr>
-        <w:spacing w:before="80" w:after="120"/>
-        <w:ind w:left="576"/>
+        <w:spacing w:before="60" w:after="80"/>
+        <w:ind w:left="432"/>
       </w:pPr>
       <w:r>
         <w:rPr>
           <w:rFonts w:ascii="Consolas" w:hAnsi="Consolas"/>
-          <w:color w:val="1E293B"/>
-          <w:sz w:val="18"/>
+          <w:color w:val="0F172A"/>
+          <w:sz w:val="17"/>
         </w:rPr>
         <w:t>+------+------------------------------+---------------+---------------+---------------------------------------+</w:t>
         <w:br/>
@@ -2046,22 +4775,26 @@
     <w:p>
       <w:pPr>
         <w:pStyle w:val="Heading3"/>
-        <w:spacing w:before="160" w:after="40"/>
+        <w:spacing w:before="200" w:after="40"/>
       </w:pPr>
       <w:r>
+        <w:rPr>
+          <w:rFonts w:ascii="Calibri" w:hAnsi="Calibri"/>
+          <w:color w:val="0F766E"/>
+        </w:rPr>
         <w:t>7.3 Temporal Threat Intensity by Weekday</w:t>
       </w:r>
     </w:p>
     <w:p>
       <w:pPr>
-        <w:spacing w:before="80" w:after="120"/>
-        <w:ind w:left="576"/>
+        <w:spacing w:before="60" w:after="80"/>
+        <w:ind w:left="432"/>
       </w:pPr>
       <w:r>
         <w:rPr>
           <w:rFonts w:ascii="Consolas" w:hAnsi="Consolas"/>
-          <w:color w:val="1E293B"/>
-          <w:sz w:val="18"/>
+          <w:color w:val="0F172A"/>
+          <w:sz w:val="17"/>
         </w:rPr>
         <w:t>+------------+------------------+------------------+-----------------+</w:t>
         <w:br/>
@@ -2093,9 +4826,13 @@
     <w:p>
       <w:pPr>
         <w:pStyle w:val="Heading3"/>
-        <w:spacing w:before="160" w:after="40"/>
+        <w:spacing w:before="200" w:after="40"/>
       </w:pPr>
       <w:r>
+        <w:rPr>
+          <w:rFonts w:ascii="Calibri" w:hAnsi="Calibri"/>
+          <w:color w:val="0F766E"/>
+        </w:rPr>
         <w:t>7.4 Performance Verification: EXPLAIN ANALYZE on Indexes</w:t>
       </w:r>
     </w:p>
@@ -2179,35 +4916,43 @@
     <w:p>
       <w:pPr>
         <w:pStyle w:val="Heading2"/>
-        <w:spacing w:before="200" w:after="80"/>
+        <w:spacing w:before="240" w:after="80"/>
       </w:pPr>
       <w:r>
+        <w:rPr>
+          <w:rFonts w:ascii="Calibri" w:hAnsi="Calibri"/>
+          <w:color w:val="1E3A8A"/>
+        </w:rPr>
         <w:t>8. Step-by-Step Setup Instructions to Reproduce</w:t>
       </w:r>
     </w:p>
     <w:p>
       <w:pPr>
         <w:pStyle w:val="Heading3"/>
-        <w:spacing w:before="160" w:after="40"/>
+        <w:spacing w:before="200" w:after="40"/>
       </w:pPr>
       <w:r>
+        <w:rPr>
+          <w:rFonts w:ascii="Calibri" w:hAnsi="Calibri"/>
+          <w:color w:val="0F766E"/>
+        </w:rPr>
         <w:t>Step 1: Environment Setup</w:t>
       </w:r>
     </w:p>
     <w:p>
       <w:pPr>
-        <w:spacing w:before="80" w:after="120"/>
-        <w:ind w:left="576"/>
+        <w:spacing w:before="60" w:after="80"/>
+        <w:ind w:left="432"/>
       </w:pPr>
       <w:r>
         <w:rPr>
           <w:rFonts w:ascii="Consolas" w:hAnsi="Consolas"/>
-          <w:color w:val="1E293B"/>
-          <w:sz w:val="18"/>
+          <w:color w:val="0F172A"/>
+          <w:sz w:val="17"/>
         </w:rPr>
-        <w:t>git clone https://github.com/NardosShumete/CIC-IDS2017_cybersecurity_project.git ids-etl-pipeline-postgres</w:t>
+        <w:t>git clone https://github.com/NardosShumete/ids-etl-pipeline-postgres-assignment.git</w:t>
         <w:br/>
-        <w:t>cd ids-etl-pipeline-postgres</w:t>
+        <w:t>cd ids-etl-pipeline-postgres-assignment</w:t>
         <w:br/>
         <w:t>python -m venv .venv</w:t>
         <w:br/>
@@ -2219,22 +4964,26 @@
     <w:p>
       <w:pPr>
         <w:pStyle w:val="Heading3"/>
-        <w:spacing w:before="160" w:after="40"/>
+        <w:spacing w:before="200" w:after="40"/>
       </w:pPr>
       <w:r>
+        <w:rPr>
+          <w:rFonts w:ascii="Calibri" w:hAnsi="Calibri"/>
+          <w:color w:val="0F766E"/>
+        </w:rPr>
         <w:t>Step 2: Database Configuration &amp; Schema Provisioning</w:t>
       </w:r>
     </w:p>
     <w:p>
       <w:pPr>
-        <w:spacing w:before="80" w:after="120"/>
-        <w:ind w:left="576"/>
+        <w:spacing w:before="60" w:after="80"/>
+        <w:ind w:left="432"/>
       </w:pPr>
       <w:r>
         <w:rPr>
           <w:rFonts w:ascii="Consolas" w:hAnsi="Consolas"/>
-          <w:color w:val="1E293B"/>
-          <w:sz w:val="18"/>
+          <w:color w:val="0F172A"/>
+          <w:sz w:val="17"/>
         </w:rPr>
         <w:t>cp .env.example .env</w:t>
         <w:br/>
@@ -2246,9 +4995,13 @@
     <w:p>
       <w:pPr>
         <w:pStyle w:val="Heading3"/>
-        <w:spacing w:before="160" w:after="40"/>
+        <w:spacing w:before="200" w:after="40"/>
       </w:pPr>
       <w:r>
+        <w:rPr>
+          <w:rFonts w:ascii="Calibri" w:hAnsi="Calibri"/>
+          <w:color w:val="0F766E"/>
+        </w:rPr>
         <w:t>Step 3: Dataset Ingestion</w:t>
       </w:r>
     </w:p>
@@ -2262,14 +5015,14 @@
     </w:p>
     <w:p>
       <w:pPr>
-        <w:spacing w:before="80" w:after="120"/>
-        <w:ind w:left="576"/>
+        <w:spacing w:before="60" w:after="80"/>
+        <w:ind w:left="432"/>
       </w:pPr>
       <w:r>
         <w:rPr>
           <w:rFonts w:ascii="Consolas" w:hAnsi="Consolas"/>
-          <w:color w:val="1E293B"/>
-          <w:sz w:val="18"/>
+          <w:color w:val="0F172A"/>
+          <w:sz w:val="17"/>
         </w:rPr>
         <w:t># Full production ETL run (2.83M records)</w:t>
         <w:br/>
@@ -2279,22 +5032,26 @@
     <w:p>
       <w:pPr>
         <w:pStyle w:val="Heading3"/>
-        <w:spacing w:before="160" w:after="40"/>
+        <w:spacing w:before="200" w:after="40"/>
       </w:pPr>
       <w:r>
+        <w:rPr>
+          <w:rFonts w:ascii="Calibri" w:hAnsi="Calibri"/>
+          <w:color w:val="0F766E"/>
+        </w:rPr>
         <w:t>Step 4: Verification and Analytics</w:t>
       </w:r>
     </w:p>
     <w:p>
       <w:pPr>
-        <w:spacing w:before="80" w:after="120"/>
-        <w:ind w:left="576"/>
+        <w:spacing w:before="60" w:after="80"/>
+        <w:ind w:left="432"/>
       </w:pPr>
       <w:r>
         <w:rPr>
           <w:rFonts w:ascii="Consolas" w:hAnsi="Consolas"/>
-          <w:color w:val="1E293B"/>
-          <w:sz w:val="18"/>
+          <w:color w:val="0F172A"/>
+          <w:sz w:val="17"/>
         </w:rPr>
         <w:t>python src/verify.py</w:t>
         <w:br/>
@@ -2306,18 +5063,26 @@
     <w:p>
       <w:pPr>
         <w:pStyle w:val="Heading2"/>
-        <w:spacing w:before="200" w:after="80"/>
+        <w:spacing w:before="240" w:after="80"/>
       </w:pPr>
       <w:r>
+        <w:rPr>
+          <w:rFonts w:ascii="Calibri" w:hAnsi="Calibri"/>
+          <w:color w:val="1E3A8A"/>
+        </w:rPr>
         <w:t>9. Challenges, Lessons Learned, and Production Roadmap</w:t>
       </w:r>
     </w:p>
     <w:p>
       <w:pPr>
         <w:pStyle w:val="Heading3"/>
-        <w:spacing w:before="160" w:after="40"/>
+        <w:spacing w:before="200" w:after="40"/>
       </w:pPr>
       <w:r>
+        <w:rPr>
+          <w:rFonts w:ascii="Calibri" w:hAnsi="Calibri"/>
+          <w:color w:val="0F766E"/>
+        </w:rPr>
         <w:t>9.1 Technical Challenges Overcome</w:t>
       </w:r>
     </w:p>
@@ -2384,9 +5149,13 @@
     <w:p>
       <w:pPr>
         <w:pStyle w:val="Heading3"/>
-        <w:spacing w:before="160" w:after="40"/>
+        <w:spacing w:before="200" w:after="40"/>
       </w:pPr>
       <w:r>
+        <w:rPr>
+          <w:rFonts w:ascii="Calibri" w:hAnsi="Calibri"/>
+          <w:color w:val="0F766E"/>
+        </w:rPr>
         <w:t>9.2 Production Roadmap</w:t>
       </w:r>
     </w:p>
@@ -2829,7 +5598,7 @@
     <w:rsid w:val="00FC693F"/>
     <w:rPr>
       <w:rFonts w:ascii="Calibri" w:hAnsi="Calibri"/>
-      <w:color w:val="333333"/>
+      <w:color w:val="1F2937"/>
       <w:sz w:val="22"/>
     </w:rPr>
   </w:style>

</xml_diff>